<commit_message>
PC -> lap: Paralela
</commit_message>
<xml_diff>
--- a/TAREAS 6 SEMESTRE/Interacción Humano Computadora/QuijasContrerasVictorManuel10092026P#6.docx
+++ b/TAREAS 6 SEMESTRE/Interacción Humano Computadora/QuijasContrerasVictorManuel10092026P#6.docx
@@ -1,6 +1,6 @@
 
 <file path=word/document.xml><?xml version="1.0" encoding="utf-8"?>
-<w:document xmlns:wpc="http://schemas.microsoft.com/office/word/2010/wordprocessingCanvas" xmlns:cx="http://schemas.microsoft.com/office/drawing/2014/chartex" xmlns:cx1="http://schemas.microsoft.com/office/drawing/2015/9/8/chartex" xmlns:cx2="http://schemas.microsoft.com/office/drawing/2015/10/21/chartex" xmlns:cx3="http://schemas.microsoft.com/office/drawing/2016/5/9/chartex" xmlns:cx4="http://schemas.microsoft.com/office/drawing/2016/5/10/chartex" xmlns:cx5="http://schemas.microsoft.com/office/drawing/2016/5/11/chartex" xmlns:cx6="http://schemas.microsoft.com/office/drawing/2016/5/12/chartex" xmlns:cx7="http://schemas.microsoft.com/office/drawing/2016/5/13/chartex" xmlns:cx8="http://schemas.microsoft.com/office/drawing/2016/5/14/chartex" xmlns:mc="http://schemas.openxmlformats.org/markup-compatibility/2006" xmlns:aink="http://schemas.microsoft.com/office/drawing/2016/ink" xmlns:am3d="http://schemas.microsoft.com/office/drawing/2017/model3d" xmlns:o="urn:schemas-microsoft-com:office:office" xmlns:oel="http://schemas.microsoft.com/office/2019/extlst" xmlns:r="http://schemas.openxmlformats.org/officeDocument/2006/relationships" xmlns:m="http://schemas.openxmlformats.org/officeDocument/2006/math" xmlns:v="urn:schemas-microsoft-com:vml" xmlns:wp14="http://schemas.microsoft.com/office/word/2010/wordprocessingDrawing" xmlns:wp="http://schemas.openxmlformats.org/drawingml/2006/wordprocessingDrawing" xmlns:w10="urn:schemas-microsoft-com:office:word" xmlns:w="http://schemas.openxmlformats.org/wordprocessingml/2006/main" xmlns:w14="http://schemas.microsoft.com/office/word/2010/wordml" xmlns:w15="http://schemas.microsoft.com/office/word/2012/wordml" xmlns:w16cei="http://schemas.microsoft.com/office/word/2026/wordml/cei" xmlns:w16cex="http://schemas.microsoft.com/office/word/2018/wordml/cex" xmlns:w16cid="http://schemas.microsoft.com/office/word/2016/wordml/cid" xmlns:w16="http://schemas.microsoft.com/office/word/2018/wordml" xmlns:w16du="http://schemas.microsoft.com/office/word/2023/wordml/word16du" xmlns:w16sdtdh="http://schemas.microsoft.com/office/word/2020/wordml/sdtdatahash" xmlns:w16sdtfl="http://schemas.microsoft.com/office/word/2024/wordml/sdtformatlock" xmlns:w16se="http://schemas.microsoft.com/office/word/2015/wordml/symex" xmlns:wpg="http://schemas.microsoft.com/office/word/2010/wordprocessingGroup" xmlns:wpi="http://schemas.microsoft.com/office/word/2010/wordprocessingInk" xmlns:wne="http://schemas.microsoft.com/office/word/2006/wordml" xmlns:wps="http://schemas.microsoft.com/office/word/2010/wordprocessingShape" mc:Ignorable="w14 w15 w16se w16cid w16 w16cex w16sdtdh w16sdtfl w16du wp14">
+<w:document xmlns:wpc="http://schemas.microsoft.com/office/word/2010/wordprocessingCanvas" xmlns:cx="http://schemas.microsoft.com/office/drawing/2014/chartex" xmlns:cx1="http://schemas.microsoft.com/office/drawing/2015/9/8/chartex" xmlns:cx2="http://schemas.microsoft.com/office/drawing/2015/10/21/chartex" xmlns:cx3="http://schemas.microsoft.com/office/drawing/2016/5/9/chartex" xmlns:cx4="http://schemas.microsoft.com/office/drawing/2016/5/10/chartex" xmlns:cx5="http://schemas.microsoft.com/office/drawing/2016/5/11/chartex" xmlns:cx6="http://schemas.microsoft.com/office/drawing/2016/5/12/chartex" xmlns:cx7="http://schemas.microsoft.com/office/drawing/2016/5/13/chartex" xmlns:cx8="http://schemas.microsoft.com/office/drawing/2016/5/14/chartex" xmlns:mc="http://schemas.openxmlformats.org/markup-compatibility/2006" xmlns:aink="http://schemas.microsoft.com/office/drawing/2016/ink" xmlns:am3d="http://schemas.microsoft.com/office/drawing/2017/model3d" xmlns:o="urn:schemas-microsoft-com:office:office" xmlns:oel="http://schemas.microsoft.com/office/2019/extlst" xmlns:r="http://schemas.openxmlformats.org/officeDocument/2006/relationships" xmlns:m="http://schemas.openxmlformats.org/officeDocument/2006/math" xmlns:v="urn:schemas-microsoft-com:vml" xmlns:wp14="http://schemas.microsoft.com/office/word/2010/wordprocessingDrawing" xmlns:wp="http://schemas.openxmlformats.org/drawingml/2006/wordprocessingDrawing" xmlns:w10="urn:schemas-microsoft-com:office:word" xmlns:w="http://schemas.openxmlformats.org/wordprocessingml/2006/main" xmlns:w14="http://schemas.microsoft.com/office/word/2010/wordml" xmlns:w15="http://schemas.microsoft.com/office/word/2012/wordml" xmlns:w16cex="http://schemas.microsoft.com/office/word/2018/wordml/cex" xmlns:w16cid="http://schemas.microsoft.com/office/word/2016/wordml/cid" xmlns:w16="http://schemas.microsoft.com/office/word/2018/wordml" xmlns:w16du="http://schemas.microsoft.com/office/word/2023/wordml/word16du" xmlns:w16sdtdh="http://schemas.microsoft.com/office/word/2020/wordml/sdtdatahash" xmlns:w16sdtfl="http://schemas.microsoft.com/office/word/2024/wordml/sdtformatlock" xmlns:w16se="http://schemas.microsoft.com/office/word/2015/wordml/symex" xmlns:wpg="http://schemas.microsoft.com/office/word/2010/wordprocessingGroup" xmlns:wpi="http://schemas.microsoft.com/office/word/2010/wordprocessingInk" xmlns:wne="http://schemas.microsoft.com/office/word/2006/wordml" xmlns:wps="http://schemas.microsoft.com/office/word/2010/wordprocessingShape" mc:Ignorable="w14 w15 w16se w16cid w16 w16cex w16sdtdh w16sdtfl w16du wp14">
   <w:background w:color="FFF7D5"/>
   <w:body>
     <w:p>
@@ -309,7 +309,7 @@
                                 <w:sz w:val="72"/>
                                 <w:szCs w:val="96"/>
                               </w:rPr>
-                              <w:t>Título de actividad</w:t>
+                              <w:t>Parseo</w:t>
                             </w:r>
                           </w:p>
                         </w:txbxContent>
@@ -356,7 +356,7 @@
                           <w:sz w:val="72"/>
                           <w:szCs w:val="96"/>
                         </w:rPr>
-                        <w:t>Título de actividad</w:t>
+                        <w:t>Parseo</w:t>
                       </w:r>
                     </w:p>
                   </w:txbxContent>
@@ -740,15 +740,7 @@
                                 <w:sz w:val="36"/>
                                 <w:szCs w:val="22"/>
                               </w:rPr>
-                              <w:t xml:space="preserve">Actividad </w:t>
-                            </w:r>
-                            <w:r>
-                              <w:rPr>
-                                <w:rFonts w:ascii="Bookman Old Style" w:eastAsia="Bookman Old Style" w:hAnsi="Bookman Old Style" w:cs="Bookman Old Style"/>
-                                <w:sz w:val="36"/>
-                                <w:szCs w:val="22"/>
-                              </w:rPr>
-                              <w:t>#n</w:t>
+                              <w:t>Practica #6</w:t>
                             </w:r>
                           </w:p>
                         </w:txbxContent>
@@ -781,15 +773,7 @@
                           <w:sz w:val="36"/>
                           <w:szCs w:val="22"/>
                         </w:rPr>
-                        <w:t xml:space="preserve">Actividad </w:t>
-                      </w:r>
-                      <w:r>
-                        <w:rPr>
-                          <w:rFonts w:ascii="Bookman Old Style" w:eastAsia="Bookman Old Style" w:hAnsi="Bookman Old Style" w:cs="Bookman Old Style"/>
-                          <w:sz w:val="36"/>
-                          <w:szCs w:val="22"/>
-                        </w:rPr>
-                        <w:t>#n</w:t>
+                        <w:t>Practica #6</w:t>
                       </w:r>
                     </w:p>
                   </w:txbxContent>
@@ -862,7 +846,7 @@
               </wp:anchor>
             </w:drawing>
           </mc:Choice>
-          <mc:Fallback>
+          <mc:Fallback xmlns:w16cei="http://schemas.microsoft.com/office/word/2026/wordml/cei">
             <w:pict>
               <v:line w14:anchorId="298B0CD5" id="Conector recto 13" o:spid="_x0000_s1026" style="position:absolute;z-index:251683328;visibility:visible;mso-wrap-style:square;mso-width-percent:0;mso-height-percent:0;mso-wrap-distance-left:9pt;mso-wrap-distance-top:0;mso-wrap-distance-right:9pt;mso-wrap-distance-bottom:0;mso-position-horizontal:absolute;mso-position-horizontal-relative:page;mso-position-vertical:absolute;mso-position-vertical-relative:text;mso-width-percent:0;mso-height-percent:0;mso-width-relative:margin;mso-height-relative:margin" from="282pt,9.5pt" to="301.5pt,9.5pt" o:gfxdata="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" strokecolor="black [3200]" strokeweight="1pt">
                 <v:stroke joinstyle="miter"/>
@@ -941,7 +925,7 @@
               </wp:anchor>
             </w:drawing>
           </mc:Choice>
-          <mc:Fallback>
+          <mc:Fallback xmlns:w16cei="http://schemas.microsoft.com/office/word/2026/wordml/cei">
             <w:pict>
               <v:line w14:anchorId="744DABE4" id="Conector recto 13" o:spid="_x0000_s1026" style="position:absolute;z-index:251681280;visibility:visible;mso-wrap-style:square;mso-width-percent:0;mso-height-percent:0;mso-wrap-distance-left:9pt;mso-wrap-distance-top:0;mso-wrap-distance-right:9pt;mso-wrap-distance-bottom:0;mso-position-horizontal:absolute;mso-position-horizontal-relative:page;mso-position-vertical:absolute;mso-position-vertical-relative:text;mso-width-percent:0;mso-height-percent:0;mso-width-relative:margin;mso-height-relative:margin" from="263.25pt,3.55pt" to="319.8pt,3.55pt" o:gfxdata="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" strokecolor="black [3200]" strokeweight="1.5pt">
                 <v:stroke dashstyle="dash"/>
@@ -1164,7 +1148,39 @@
                                 <w:sz w:val="44"/>
                                 <w:szCs w:val="48"/>
                               </w:rPr>
-                              <w:t>18/08/2026</w:t>
+                              <w:t>1</w:t>
+                            </w:r>
+                            <w:r>
+                              <w:rPr>
+                                <w:rFonts w:asciiTheme="majorHAnsi" w:hAnsiTheme="majorHAnsi" w:cstheme="majorHAnsi"/>
+                                <w:sz w:val="44"/>
+                                <w:szCs w:val="48"/>
+                              </w:rPr>
+                              <w:t>1</w:t>
+                            </w:r>
+                            <w:r>
+                              <w:rPr>
+                                <w:rFonts w:asciiTheme="majorHAnsi" w:hAnsiTheme="majorHAnsi" w:cstheme="majorHAnsi"/>
+                                <w:sz w:val="44"/>
+                                <w:szCs w:val="48"/>
+                              </w:rPr>
+                              <w:t>/0</w:t>
+                            </w:r>
+                            <w:r>
+                              <w:rPr>
+                                <w:rFonts w:asciiTheme="majorHAnsi" w:hAnsiTheme="majorHAnsi" w:cstheme="majorHAnsi"/>
+                                <w:sz w:val="44"/>
+                                <w:szCs w:val="48"/>
+                              </w:rPr>
+                              <w:t>9</w:t>
+                            </w:r>
+                            <w:r>
+                              <w:rPr>
+                                <w:rFonts w:asciiTheme="majorHAnsi" w:hAnsiTheme="majorHAnsi" w:cstheme="majorHAnsi"/>
+                                <w:sz w:val="44"/>
+                                <w:szCs w:val="48"/>
+                              </w:rPr>
+                              <w:t>/2026</w:t>
                             </w:r>
                           </w:p>
                           <w:p>
@@ -1358,7 +1374,39 @@
                           <w:sz w:val="44"/>
                           <w:szCs w:val="48"/>
                         </w:rPr>
-                        <w:t>18/08/2026</w:t>
+                        <w:t>1</w:t>
+                      </w:r>
+                      <w:r>
+                        <w:rPr>
+                          <w:rFonts w:asciiTheme="majorHAnsi" w:hAnsiTheme="majorHAnsi" w:cstheme="majorHAnsi"/>
+                          <w:sz w:val="44"/>
+                          <w:szCs w:val="48"/>
+                        </w:rPr>
+                        <w:t>1</w:t>
+                      </w:r>
+                      <w:r>
+                        <w:rPr>
+                          <w:rFonts w:asciiTheme="majorHAnsi" w:hAnsiTheme="majorHAnsi" w:cstheme="majorHAnsi"/>
+                          <w:sz w:val="44"/>
+                          <w:szCs w:val="48"/>
+                        </w:rPr>
+                        <w:t>/0</w:t>
+                      </w:r>
+                      <w:r>
+                        <w:rPr>
+                          <w:rFonts w:asciiTheme="majorHAnsi" w:hAnsiTheme="majorHAnsi" w:cstheme="majorHAnsi"/>
+                          <w:sz w:val="44"/>
+                          <w:szCs w:val="48"/>
+                        </w:rPr>
+                        <w:t>9</w:t>
+                      </w:r>
+                      <w:r>
+                        <w:rPr>
+                          <w:rFonts w:asciiTheme="majorHAnsi" w:hAnsiTheme="majorHAnsi" w:cstheme="majorHAnsi"/>
+                          <w:sz w:val="44"/>
+                          <w:szCs w:val="48"/>
+                        </w:rPr>
+                        <w:t>/2026</w:t>
                       </w:r>
                     </w:p>
                     <w:p>
@@ -1397,7 +1445,7 @@
         <w:br w:type="page"/>
       </w:r>
     </w:p>
-    <w:bookmarkStart w:id="0" w:name="_Toc220850609" w:displacedByCustomXml="next"/>
+    <w:bookmarkStart w:id="0" w:name="_Toc240063234" w:displacedByCustomXml="next"/>
     <w:sdt>
       <w:sdtPr>
         <w:rPr>
@@ -1465,7 +1513,7 @@
           <w:r>
             <w:fldChar w:fldCharType="separate"/>
           </w:r>
-          <w:hyperlink w:anchor="_Toc220850609" w:history="1">
+          <w:hyperlink w:anchor="_Toc240063234" w:history="1">
             <w:r>
               <w:rPr>
                 <w:rStyle w:val="Hipervnculo"/>
@@ -1493,7 +1541,7 @@
                 <w:noProof/>
                 <w:webHidden/>
               </w:rPr>
-              <w:instrText xml:space="preserve"> PAGEREF _Toc220850609 \h </w:instrText>
+              <w:instrText xml:space="preserve"> PAGEREF _Toc240063234 \h </w:instrText>
             </w:r>
             <w:r>
               <w:rPr>
@@ -1536,7 +1584,7 @@
               <w:color w:val="auto"/>
             </w:rPr>
           </w:pPr>
-          <w:hyperlink w:anchor="_Toc220850610" w:history="1">
+          <w:hyperlink w:anchor="_Toc240063235" w:history="1">
             <w:r>
               <w:rPr>
                 <w:rStyle w:val="Hipervnculo"/>
@@ -1563,7 +1611,7 @@
                 <w:noProof/>
                 <w:webHidden/>
               </w:rPr>
-              <w:instrText xml:space="preserve"> PAGEREF _Toc220850610 \h </w:instrText>
+              <w:instrText xml:space="preserve"> PAGEREF _Toc240063235 \h </w:instrText>
             </w:r>
             <w:r>
               <w:rPr>
@@ -1606,7 +1654,7 @@
               <w:color w:val="auto"/>
             </w:rPr>
           </w:pPr>
-          <w:hyperlink w:anchor="_Toc220850611" w:history="1">
+          <w:hyperlink w:anchor="_Toc240063236" w:history="1">
             <w:r>
               <w:rPr>
                 <w:rStyle w:val="Hipervnculo"/>
@@ -1633,7 +1681,7 @@
                 <w:noProof/>
                 <w:webHidden/>
               </w:rPr>
-              <w:instrText xml:space="preserve"> PAGEREF _Toc220850611 \h </w:instrText>
+              <w:instrText xml:space="preserve"> PAGEREF _Toc240063236 \h </w:instrText>
             </w:r>
             <w:r>
               <w:rPr>
@@ -1666,7 +1714,7 @@
         </w:p>
         <w:p>
           <w:pPr>
-            <w:pStyle w:val="TDC1"/>
+            <w:pStyle w:val="TDC2"/>
             <w:tabs>
               <w:tab w:val="right" w:leader="dot" w:pos="9111"/>
             </w:tabs>
@@ -1676,13 +1724,13 @@
               <w:color w:val="auto"/>
             </w:rPr>
           </w:pPr>
-          <w:hyperlink w:anchor="_Toc220850612" w:history="1">
+          <w:hyperlink w:anchor="_Toc240063237" w:history="1">
             <w:r>
               <w:rPr>
                 <w:rStyle w:val="Hipervnculo"/>
                 <w:noProof/>
               </w:rPr>
-              <w:t>Conclusión</w:t>
+              <w:t>Interfaz</w:t>
             </w:r>
             <w:r>
               <w:rPr>
@@ -1703,7 +1751,7 @@
                 <w:noProof/>
                 <w:webHidden/>
               </w:rPr>
-              <w:instrText xml:space="preserve"> PAGEREF _Toc220850612 \h </w:instrText>
+              <w:instrText xml:space="preserve"> PAGEREF _Toc240063237 \h </w:instrText>
             </w:r>
             <w:r>
               <w:rPr>
@@ -1736,6 +1784,76 @@
         </w:p>
         <w:p>
           <w:pPr>
+            <w:pStyle w:val="TDC2"/>
+            <w:tabs>
+              <w:tab w:val="right" w:leader="dot" w:pos="9111"/>
+            </w:tabs>
+            <w:rPr>
+              <w:rFonts w:asciiTheme="minorHAnsi" w:eastAsiaTheme="minorEastAsia" w:hAnsiTheme="minorHAnsi" w:cstheme="minorBidi"/>
+              <w:noProof/>
+              <w:color w:val="auto"/>
+            </w:rPr>
+          </w:pPr>
+          <w:hyperlink w:anchor="_Toc240063238" w:history="1">
+            <w:r>
+              <w:rPr>
+                <w:rStyle w:val="Hipervnculo"/>
+                <w:noProof/>
+              </w:rPr>
+              <w:t>Clase</w:t>
+            </w:r>
+            <w:r>
+              <w:rPr>
+                <w:noProof/>
+                <w:webHidden/>
+              </w:rPr>
+              <w:tab/>
+            </w:r>
+            <w:r>
+              <w:rPr>
+                <w:noProof/>
+                <w:webHidden/>
+              </w:rPr>
+              <w:fldChar w:fldCharType="begin"/>
+            </w:r>
+            <w:r>
+              <w:rPr>
+                <w:noProof/>
+                <w:webHidden/>
+              </w:rPr>
+              <w:instrText xml:space="preserve"> PAGEREF _Toc240063238 \h </w:instrText>
+            </w:r>
+            <w:r>
+              <w:rPr>
+                <w:noProof/>
+                <w:webHidden/>
+              </w:rPr>
+            </w:r>
+            <w:r>
+              <w:rPr>
+                <w:noProof/>
+                <w:webHidden/>
+              </w:rPr>
+              <w:fldChar w:fldCharType="separate"/>
+            </w:r>
+            <w:r>
+              <w:rPr>
+                <w:noProof/>
+                <w:webHidden/>
+              </w:rPr>
+              <w:t>3</w:t>
+            </w:r>
+            <w:r>
+              <w:rPr>
+                <w:noProof/>
+                <w:webHidden/>
+              </w:rPr>
+              <w:fldChar w:fldCharType="end"/>
+            </w:r>
+          </w:hyperlink>
+        </w:p>
+        <w:p>
+          <w:pPr>
             <w:pStyle w:val="TDC1"/>
             <w:tabs>
               <w:tab w:val="right" w:leader="dot" w:pos="9111"/>
@@ -1746,7 +1864,7 @@
               <w:color w:val="auto"/>
             </w:rPr>
           </w:pPr>
-          <w:hyperlink w:anchor="_Toc220850613" w:history="1">
+          <w:hyperlink w:anchor="_Toc240063239" w:history="1">
             <w:r>
               <w:rPr>
                 <w:rStyle w:val="Hipervnculo"/>
@@ -1773,7 +1891,7 @@
                 <w:noProof/>
                 <w:webHidden/>
               </w:rPr>
-              <w:instrText xml:space="preserve"> PAGEREF _Toc220850613 \h </w:instrText>
+              <w:instrText xml:space="preserve"> PAGEREF _Toc240063239 \h </w:instrText>
             </w:r>
             <w:r>
               <w:rPr>
@@ -1793,7 +1911,7 @@
                 <w:noProof/>
                 <w:webHidden/>
               </w:rPr>
-              <w:t>1</w:t>
+              <w:t>5</w:t>
             </w:r>
             <w:r>
               <w:rPr>
@@ -1820,31 +1938,310 @@
       <w:pPr>
         <w:pStyle w:val="Ttulo1"/>
       </w:pPr>
-      <w:bookmarkStart w:id="1" w:name="_Toc220850610"/>
+      <w:bookmarkStart w:id="1" w:name="_Toc240063235"/>
       <w:r>
         <w:t>Tabla de ilustraciones</w:t>
       </w:r>
       <w:bookmarkEnd w:id="1"/>
     </w:p>
     <w:p>
-      <w:fldSimple w:instr=" TOC \h \z \c &quot;Ilustración&quot; ">
+      <w:pPr>
+        <w:pStyle w:val="Tabladeilustraciones"/>
+        <w:tabs>
+          <w:tab w:val="right" w:leader="dot" w:pos="9111"/>
+        </w:tabs>
+        <w:rPr>
+          <w:noProof/>
+        </w:rPr>
+      </w:pPr>
+      <w:r>
+        <w:fldChar w:fldCharType="begin"/>
+      </w:r>
+      <w:r>
+        <w:instrText xml:space="preserve"> TOC \h \z \c "Ilustración" </w:instrText>
+      </w:r>
+      <w:r>
+        <w:fldChar w:fldCharType="separate"/>
+      </w:r>
+      <w:hyperlink w:anchor="_Toc240063240" w:history="1">
         <w:r>
           <w:rPr>
-            <w:b/>
-            <w:bCs/>
+            <w:rStyle w:val="Hipervnculo"/>
             <w:noProof/>
-            <w:lang w:val="es-ES"/>
           </w:rPr>
-          <w:t>No se encuentran elementos de tabla de ilustraciones.</w:t>
+          <w:t>Ilustración 1. Vista de la actividad principal</w:t>
         </w:r>
-      </w:fldSimple>
+        <w:r>
+          <w:rPr>
+            <w:noProof/>
+            <w:webHidden/>
+          </w:rPr>
+          <w:tab/>
+        </w:r>
+        <w:r>
+          <w:rPr>
+            <w:noProof/>
+            <w:webHidden/>
+          </w:rPr>
+          <w:fldChar w:fldCharType="begin"/>
+        </w:r>
+        <w:r>
+          <w:rPr>
+            <w:noProof/>
+            <w:webHidden/>
+          </w:rPr>
+          <w:instrText xml:space="preserve"> PAGEREF _Toc240063240 \h </w:instrText>
+        </w:r>
+        <w:r>
+          <w:rPr>
+            <w:noProof/>
+            <w:webHidden/>
+          </w:rPr>
+        </w:r>
+        <w:r>
+          <w:rPr>
+            <w:noProof/>
+            <w:webHidden/>
+          </w:rPr>
+          <w:fldChar w:fldCharType="separate"/>
+        </w:r>
+        <w:r>
+          <w:rPr>
+            <w:noProof/>
+            <w:webHidden/>
+          </w:rPr>
+          <w:t>2</w:t>
+        </w:r>
+        <w:r>
+          <w:rPr>
+            <w:noProof/>
+            <w:webHidden/>
+          </w:rPr>
+          <w:fldChar w:fldCharType="end"/>
+        </w:r>
+      </w:hyperlink>
+    </w:p>
+    <w:p>
+      <w:pPr>
+        <w:pStyle w:val="Tabladeilustraciones"/>
+        <w:tabs>
+          <w:tab w:val="right" w:leader="dot" w:pos="9111"/>
+        </w:tabs>
+        <w:rPr>
+          <w:noProof/>
+        </w:rPr>
+      </w:pPr>
+      <w:hyperlink w:anchor="_Toc240063241" w:history="1">
+        <w:r>
+          <w:rPr>
+            <w:rStyle w:val="Hipervnculo"/>
+            <w:noProof/>
+          </w:rPr>
+          <w:t>Ilustración 2. Vista calculadora</w:t>
+        </w:r>
+        <w:r>
+          <w:rPr>
+            <w:noProof/>
+            <w:webHidden/>
+          </w:rPr>
+          <w:tab/>
+        </w:r>
+        <w:r>
+          <w:rPr>
+            <w:noProof/>
+            <w:webHidden/>
+          </w:rPr>
+          <w:fldChar w:fldCharType="begin"/>
+        </w:r>
+        <w:r>
+          <w:rPr>
+            <w:noProof/>
+            <w:webHidden/>
+          </w:rPr>
+          <w:instrText xml:space="preserve"> PAGEREF _Toc240063241 \h </w:instrText>
+        </w:r>
+        <w:r>
+          <w:rPr>
+            <w:noProof/>
+            <w:webHidden/>
+          </w:rPr>
+        </w:r>
+        <w:r>
+          <w:rPr>
+            <w:noProof/>
+            <w:webHidden/>
+          </w:rPr>
+          <w:fldChar w:fldCharType="separate"/>
+        </w:r>
+        <w:r>
+          <w:rPr>
+            <w:noProof/>
+            <w:webHidden/>
+          </w:rPr>
+          <w:t>3</w:t>
+        </w:r>
+        <w:r>
+          <w:rPr>
+            <w:noProof/>
+            <w:webHidden/>
+          </w:rPr>
+          <w:fldChar w:fldCharType="end"/>
+        </w:r>
+      </w:hyperlink>
+    </w:p>
+    <w:p>
+      <w:pPr>
+        <w:pStyle w:val="Tabladeilustraciones"/>
+        <w:tabs>
+          <w:tab w:val="right" w:leader="dot" w:pos="9111"/>
+        </w:tabs>
+        <w:rPr>
+          <w:noProof/>
+        </w:rPr>
+      </w:pPr>
+      <w:hyperlink w:anchor="_Toc240063242" w:history="1">
+        <w:r>
+          <w:rPr>
+            <w:rStyle w:val="Hipervnculo"/>
+            <w:noProof/>
+          </w:rPr>
+          <w:t>Ilustración 3. Clase "Opcion" – asignaciones</w:t>
+        </w:r>
+        <w:r>
+          <w:rPr>
+            <w:noProof/>
+            <w:webHidden/>
+          </w:rPr>
+          <w:tab/>
+        </w:r>
+        <w:r>
+          <w:rPr>
+            <w:noProof/>
+            <w:webHidden/>
+          </w:rPr>
+          <w:fldChar w:fldCharType="begin"/>
+        </w:r>
+        <w:r>
+          <w:rPr>
+            <w:noProof/>
+            <w:webHidden/>
+          </w:rPr>
+          <w:instrText xml:space="preserve"> PAGEREF _Toc240063242 \h </w:instrText>
+        </w:r>
+        <w:r>
+          <w:rPr>
+            <w:noProof/>
+            <w:webHidden/>
+          </w:rPr>
+        </w:r>
+        <w:r>
+          <w:rPr>
+            <w:noProof/>
+            <w:webHidden/>
+          </w:rPr>
+          <w:fldChar w:fldCharType="separate"/>
+        </w:r>
+        <w:r>
+          <w:rPr>
+            <w:noProof/>
+            <w:webHidden/>
+          </w:rPr>
+          <w:t>4</w:t>
+        </w:r>
+        <w:r>
+          <w:rPr>
+            <w:noProof/>
+            <w:webHidden/>
+          </w:rPr>
+          <w:fldChar w:fldCharType="end"/>
+        </w:r>
+      </w:hyperlink>
+    </w:p>
+    <w:p>
+      <w:pPr>
+        <w:pStyle w:val="Tabladeilustraciones"/>
+        <w:tabs>
+          <w:tab w:val="right" w:leader="dot" w:pos="9111"/>
+        </w:tabs>
+        <w:rPr>
+          <w:noProof/>
+        </w:rPr>
+      </w:pPr>
+      <w:hyperlink w:anchor="_Toc240063243" w:history="1">
+        <w:r>
+          <w:rPr>
+            <w:rStyle w:val="Hipervnculo"/>
+            <w:noProof/>
+          </w:rPr>
+          <w:t>Ilustración 4. método "onClick"</w:t>
+        </w:r>
+        <w:r>
+          <w:rPr>
+            <w:noProof/>
+            <w:webHidden/>
+          </w:rPr>
+          <w:tab/>
+        </w:r>
+        <w:r>
+          <w:rPr>
+            <w:noProof/>
+            <w:webHidden/>
+          </w:rPr>
+          <w:fldChar w:fldCharType="begin"/>
+        </w:r>
+        <w:r>
+          <w:rPr>
+            <w:noProof/>
+            <w:webHidden/>
+          </w:rPr>
+          <w:instrText xml:space="preserve"> PAGEREF _Toc240063243 \h </w:instrText>
+        </w:r>
+        <w:r>
+          <w:rPr>
+            <w:noProof/>
+            <w:webHidden/>
+          </w:rPr>
+        </w:r>
+        <w:r>
+          <w:rPr>
+            <w:noProof/>
+            <w:webHidden/>
+          </w:rPr>
+          <w:fldChar w:fldCharType="separate"/>
+        </w:r>
+        <w:r>
+          <w:rPr>
+            <w:noProof/>
+            <w:webHidden/>
+          </w:rPr>
+          <w:t>5</w:t>
+        </w:r>
+        <w:r>
+          <w:rPr>
+            <w:noProof/>
+            <w:webHidden/>
+          </w:rPr>
+          <w:fldChar w:fldCharType="end"/>
+        </w:r>
+      </w:hyperlink>
+    </w:p>
+    <w:p>
+      <w:r>
+        <w:rPr>
+          <w:b/>
+          <w:bCs/>
+          <w:noProof/>
+          <w:lang w:val="es-ES"/>
+        </w:rPr>
+        <w:fldChar w:fldCharType="end"/>
+      </w:r>
     </w:p>
     <w:p/>
     <w:p>
       <w:pPr>
         <w:pStyle w:val="Ttulo1"/>
       </w:pPr>
-      <w:bookmarkStart w:id="2" w:name="_Toc220850611"/>
+      <w:bookmarkStart w:id="2" w:name="_Toc240063236"/>
       <w:r>
         <w:t>Desarrollo</w:t>
       </w:r>
@@ -1853,18 +2250,12 @@
     <w:p>
       <w:pPr>
         <w:spacing w:line="240" w:lineRule="auto"/>
-        <w:ind w:firstLine="708"/>
       </w:pPr>
       <w:r>
-        <w:t xml:space="preserve">Sangría siempre en la primera línea </w:t>
+        <w:tab/>
       </w:r>
-      <w:proofErr w:type="spellStart"/>
       <w:r>
-        <w:t>blablablablablablabla</w:t>
-      </w:r>
-      <w:proofErr w:type="spellEnd"/>
-      <w:r>
-        <w:t xml:space="preserve"> </w:t>
+        <w:t xml:space="preserve">La solicitud de esta actividad fue la de desarrollar una pequeña calculadora capaz de tomar los datos necesarios por medio de una interfaz con los elementos que anteriormente habíamos visto en clase, además de usar una nueva función llamada “parse” que se encarga de transformar un elemento tipo cadena de caracteres a un tipo operable (como enteros, flotantes o dobles). </w:t>
       </w:r>
     </w:p>
     <w:p>
@@ -1872,63 +2263,836 @@
         <w:spacing w:line="240" w:lineRule="auto"/>
       </w:pPr>
       <w:r>
-        <w:t>Hola mundo</w:t>
+        <w:tab/>
+        <w:t xml:space="preserve">La función requiere de estar dentro de un bloque de código que atrape interrupciones en el programa (try-catch), pues la función parse lanza excepciones si el objeto dentro no es solo un número. </w:t>
       </w:r>
     </w:p>
     <w:p>
       <w:pPr>
-        <w:pStyle w:val="Ttulo1"/>
-      </w:pPr>
-      <w:bookmarkStart w:id="3" w:name="_Toc220850613"/>
+        <w:pStyle w:val="Ttulo2"/>
+      </w:pPr>
+      <w:bookmarkStart w:id="3" w:name="_Toc240063237"/>
       <w:r>
-        <w:t>Bibliografía</w:t>
+        <w:t>Interfaz</w:t>
       </w:r>
       <w:bookmarkEnd w:id="3"/>
     </w:p>
     <w:p>
       <w:r>
-        <w:t>Hola soy una bibliografía en formato APA</w:t>
+        <w:tab/>
+        <w:t xml:space="preserve">Esta nueva función se encuentra dentro del menú principal, remplazando el botón de “Refresh” por </w:t>
       </w:r>
       <w:r>
-        <w:t>6</w:t>
+        <w:rPr>
+          <w:i/>
+          <w:iCs/>
+        </w:rPr>
+        <w:t>Calculadora,</w:t>
+      </w:r>
+      <w:r>
+        <w:rPr>
+          <w:i/>
+          <w:iCs/>
+        </w:rPr>
+        <w:t xml:space="preserve"> </w:t>
+      </w:r>
+      <w:r>
+        <w:t>que te llevará a la nueva vista con las opciones de la calculadora.</w:t>
+      </w:r>
+    </w:p>
+    <w:p>
+      <w:r>
+        <w:rPr>
+          <w:noProof/>
+        </w:rPr>
+        <w:lastRenderedPageBreak/>
+        <mc:AlternateContent>
+          <mc:Choice Requires="wps">
+            <w:drawing>
+              <wp:anchor distT="0" distB="0" distL="114300" distR="114300" simplePos="0" relativeHeight="251686400" behindDoc="0" locked="0" layoutInCell="1" allowOverlap="1" wp14:anchorId="19B2F28C" wp14:editId="6DE3E561">
+                <wp:simplePos x="0" y="0"/>
+                <wp:positionH relativeFrom="column">
+                  <wp:posOffset>871855</wp:posOffset>
+                </wp:positionH>
+                <wp:positionV relativeFrom="paragraph">
+                  <wp:posOffset>6508750</wp:posOffset>
+                </wp:positionV>
+                <wp:extent cx="3869055" cy="635"/>
+                <wp:effectExtent l="0" t="0" r="17145" b="8255"/>
+                <wp:wrapTopAndBottom/>
+                <wp:docPr id="1643705355" name="Cuadro de texto 1"/>
+                <wp:cNvGraphicFramePr/>
+                <a:graphic xmlns:a="http://schemas.openxmlformats.org/drawingml/2006/main">
+                  <a:graphicData uri="http://schemas.microsoft.com/office/word/2010/wordprocessingShape">
+                    <wps:wsp>
+                      <wps:cNvSpPr txBox="1"/>
+                      <wps:spPr>
+                        <a:xfrm>
+                          <a:off x="0" y="0"/>
+                          <a:ext cx="3869055" cy="635"/>
+                        </a:xfrm>
+                        <a:prstGeom prst="rect">
+                          <a:avLst/>
+                        </a:prstGeom>
+                        <a:noFill/>
+                        <a:ln>
+                          <a:noFill/>
+                        </a:ln>
+                      </wps:spPr>
+                      <wps:txbx>
+                        <w:txbxContent>
+                          <w:p>
+                            <w:pPr>
+                              <w:pStyle w:val="Descripcin"/>
+                              <w:rPr>
+                                <w:noProof/>
+                                <w:color w:val="000000"/>
+                              </w:rPr>
+                            </w:pPr>
+                            <w:bookmarkStart w:id="4" w:name="_Toc240063240"/>
+                            <w:r>
+                              <w:t xml:space="preserve">Ilustración </w:t>
+                            </w:r>
+                            <w:fldSimple w:instr=" SEQ Ilustración \* ARABIC ">
+                              <w:r>
+                                <w:rPr>
+                                  <w:noProof/>
+                                </w:rPr>
+                                <w:t>1</w:t>
+                              </w:r>
+                            </w:fldSimple>
+                            <w:r>
+                              <w:t>. Vista de la actividad principal</w:t>
+                            </w:r>
+                            <w:bookmarkEnd w:id="4"/>
+                          </w:p>
+                        </w:txbxContent>
+                      </wps:txbx>
+                      <wps:bodyPr rot="0" spcFirstLastPara="0" vertOverflow="overflow" horzOverflow="overflow" vert="horz" wrap="square" lIns="0" tIns="0" rIns="0" bIns="0" numCol="1" spcCol="0" rtlCol="0" fromWordArt="0" anchor="t" anchorCtr="0" forceAA="0" compatLnSpc="1">
+                        <a:prstTxWarp prst="textNoShape">
+                          <a:avLst/>
+                        </a:prstTxWarp>
+                        <a:spAutoFit/>
+                      </wps:bodyPr>
+                    </wps:wsp>
+                  </a:graphicData>
+                </a:graphic>
+              </wp:anchor>
+            </w:drawing>
+          </mc:Choice>
+          <mc:Fallback>
+            <w:pict>
+              <v:shape w14:anchorId="19B2F28C" id="Cuadro de texto 1" o:spid="_x0000_s1030" type="#_x0000_t202" style="position:absolute;left:0;text-align:left;margin-left:68.65pt;margin-top:512.5pt;width:304.65pt;height:.05pt;z-index:251686400;visibility:visible;mso-wrap-style:square;mso-wrap-distance-left:9pt;mso-wrap-distance-top:0;mso-wrap-distance-right:9pt;mso-wrap-distance-bottom:0;mso-position-horizontal:absolute;mso-position-horizontal-relative:text;mso-position-vertical:absolute;mso-position-vertical-relative:text;v-text-anchor:top" o:gfxdata="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" filled="f" stroked="f">
+                <v:textbox style="mso-fit-shape-to-text:t" inset="0,0,0,0">
+                  <w:txbxContent>
+                    <w:p>
+                      <w:pPr>
+                        <w:pStyle w:val="Descripcin"/>
+                        <w:rPr>
+                          <w:noProof/>
+                          <w:color w:val="000000"/>
+                        </w:rPr>
+                      </w:pPr>
+                      <w:bookmarkStart w:id="5" w:name="_Toc240063240"/>
+                      <w:r>
+                        <w:t xml:space="preserve">Ilustración </w:t>
+                      </w:r>
+                      <w:fldSimple w:instr=" SEQ Ilustración \* ARABIC ">
+                        <w:r>
+                          <w:rPr>
+                            <w:noProof/>
+                          </w:rPr>
+                          <w:t>1</w:t>
+                        </w:r>
+                      </w:fldSimple>
+                      <w:r>
+                        <w:t>. Vista de la actividad principal</w:t>
+                      </w:r>
+                      <w:bookmarkEnd w:id="5"/>
+                    </w:p>
+                  </w:txbxContent>
+                </v:textbox>
+                <w10:wrap type="topAndBottom"/>
+              </v:shape>
+            </w:pict>
+          </mc:Fallback>
+        </mc:AlternateContent>
+      </w:r>
+      <w:r>
+        <w:rPr>
+          <w:noProof/>
+        </w:rPr>
+        <w:drawing>
+          <wp:anchor distT="0" distB="0" distL="114300" distR="114300" simplePos="0" relativeHeight="251684352" behindDoc="0" locked="0" layoutInCell="1" allowOverlap="1" wp14:anchorId="2F4D0447" wp14:editId="4B69FD5A">
+            <wp:simplePos x="0" y="0"/>
+            <wp:positionH relativeFrom="page">
+              <wp:align>center</wp:align>
+            </wp:positionH>
+            <wp:positionV relativeFrom="margin">
+              <wp:align>top</wp:align>
+            </wp:positionV>
+            <wp:extent cx="3869055" cy="6451600"/>
+            <wp:effectExtent l="0" t="0" r="0" b="6350"/>
+            <wp:wrapTopAndBottom/>
+            <wp:docPr id="1711463210" name="Imagen 7"/>
+            <wp:cNvGraphicFramePr>
+              <a:graphicFrameLocks xmlns:a="http://schemas.openxmlformats.org/drawingml/2006/main" noChangeAspect="1"/>
+            </wp:cNvGraphicFramePr>
+            <a:graphic xmlns:a="http://schemas.openxmlformats.org/drawingml/2006/main">
+              <a:graphicData uri="http://schemas.openxmlformats.org/drawingml/2006/picture">
+                <pic:pic xmlns:pic="http://schemas.openxmlformats.org/drawingml/2006/picture">
+                  <pic:nvPicPr>
+                    <pic:cNvPr id="0" name="Picture 1"/>
+                    <pic:cNvPicPr>
+                      <a:picLocks noChangeAspect="1" noChangeArrowheads="1"/>
+                    </pic:cNvPicPr>
+                  </pic:nvPicPr>
+                  <pic:blipFill>
+                    <a:blip r:embed="rId12">
+                      <a:extLst>
+                        <a:ext uri="{28A0092B-C50C-407E-A947-70E740481C1C}">
+                          <a14:useLocalDpi xmlns:a14="http://schemas.microsoft.com/office/drawing/2010/main" val="0"/>
+                        </a:ext>
+                      </a:extLst>
+                    </a:blip>
+                    <a:srcRect/>
+                    <a:stretch>
+                      <a:fillRect/>
+                    </a:stretch>
+                  </pic:blipFill>
+                  <pic:spPr bwMode="auto">
+                    <a:xfrm>
+                      <a:off x="0" y="0"/>
+                      <a:ext cx="3869055" cy="6451600"/>
+                    </a:xfrm>
+                    <a:prstGeom prst="rect">
+                      <a:avLst/>
+                    </a:prstGeom>
+                    <a:noFill/>
+                    <a:ln>
+                      <a:noFill/>
+                    </a:ln>
+                  </pic:spPr>
+                </pic:pic>
+              </a:graphicData>
+            </a:graphic>
+          </wp:anchor>
+        </w:drawing>
+      </w:r>
+      <w:r>
+        <w:tab/>
+        <w:t xml:space="preserve">En la vista de opción están las opciones para ingresar los dos valores necesarios, las distintas opciones para operar con ellos, una ventana por donde sale el resultado y un botón para limpiar los valores ingresados. </w:t>
+      </w:r>
+    </w:p>
+    <w:p>
+      <w:r>
+        <w:tab/>
+        <w:t>Para la alineación se utilizó un diseño vertical (vertical layout) para el espacio de ingresar datos y los botones de: suma, resta, multiplicación y división. Y para la parte del resultado se insertó un diseño libre (constraint layout) en el que se colocó una etiqueta para ingresar el resultado y debajo el botón para limpiar las entradas.</w:t>
+      </w:r>
+    </w:p>
+    <w:p>
+      <w:r>
+        <w:rPr>
+          <w:noProof/>
+        </w:rPr>
+        <w:lastRenderedPageBreak/>
+        <mc:AlternateContent>
+          <mc:Choice Requires="wps">
+            <w:drawing>
+              <wp:anchor distT="0" distB="0" distL="114300" distR="114300" simplePos="0" relativeHeight="251689472" behindDoc="0" locked="0" layoutInCell="1" allowOverlap="1" wp14:anchorId="3DDC8F23" wp14:editId="3FB8ABEC">
+                <wp:simplePos x="0" y="0"/>
+                <wp:positionH relativeFrom="column">
+                  <wp:posOffset>1206500</wp:posOffset>
+                </wp:positionH>
+                <wp:positionV relativeFrom="paragraph">
+                  <wp:posOffset>7137823</wp:posOffset>
+                </wp:positionV>
+                <wp:extent cx="3378200" cy="635"/>
+                <wp:effectExtent l="0" t="0" r="12700" b="8255"/>
+                <wp:wrapTopAndBottom/>
+                <wp:docPr id="1423532170" name="Cuadro de texto 1"/>
+                <wp:cNvGraphicFramePr/>
+                <a:graphic xmlns:a="http://schemas.openxmlformats.org/drawingml/2006/main">
+                  <a:graphicData uri="http://schemas.microsoft.com/office/word/2010/wordprocessingShape">
+                    <wps:wsp>
+                      <wps:cNvSpPr txBox="1"/>
+                      <wps:spPr>
+                        <a:xfrm>
+                          <a:off x="0" y="0"/>
+                          <a:ext cx="3378200" cy="635"/>
+                        </a:xfrm>
+                        <a:prstGeom prst="rect">
+                          <a:avLst/>
+                        </a:prstGeom>
+                        <a:noFill/>
+                        <a:ln>
+                          <a:noFill/>
+                        </a:ln>
+                      </wps:spPr>
+                      <wps:txbx>
+                        <w:txbxContent>
+                          <w:p>
+                            <w:pPr>
+                              <w:pStyle w:val="Descripcin"/>
+                              <w:rPr>
+                                <w:noProof/>
+                                <w:color w:val="000000"/>
+                              </w:rPr>
+                            </w:pPr>
+                            <w:bookmarkStart w:id="6" w:name="_Toc240063241"/>
+                            <w:r>
+                              <w:t xml:space="preserve">Ilustración </w:t>
+                            </w:r>
+                            <w:fldSimple w:instr=" SEQ Ilustración \* ARABIC ">
+                              <w:r>
+                                <w:rPr>
+                                  <w:noProof/>
+                                </w:rPr>
+                                <w:t>2</w:t>
+                              </w:r>
+                            </w:fldSimple>
+                            <w:r>
+                              <w:t>. Vista calculadora</w:t>
+                            </w:r>
+                            <w:bookmarkEnd w:id="6"/>
+                          </w:p>
+                        </w:txbxContent>
+                      </wps:txbx>
+                      <wps:bodyPr rot="0" spcFirstLastPara="0" vertOverflow="overflow" horzOverflow="overflow" vert="horz" wrap="square" lIns="0" tIns="0" rIns="0" bIns="0" numCol="1" spcCol="0" rtlCol="0" fromWordArt="0" anchor="t" anchorCtr="0" forceAA="0" compatLnSpc="1">
+                        <a:prstTxWarp prst="textNoShape">
+                          <a:avLst/>
+                        </a:prstTxWarp>
+                        <a:spAutoFit/>
+                      </wps:bodyPr>
+                    </wps:wsp>
+                  </a:graphicData>
+                </a:graphic>
+              </wp:anchor>
+            </w:drawing>
+          </mc:Choice>
+          <mc:Fallback>
+            <w:pict>
+              <v:shape w14:anchorId="3DDC8F23" id="_x0000_s1031" type="#_x0000_t202" style="position:absolute;left:0;text-align:left;margin-left:95pt;margin-top:562.05pt;width:266pt;height:.05pt;z-index:251689472;visibility:visible;mso-wrap-style:square;mso-wrap-distance-left:9pt;mso-wrap-distance-top:0;mso-wrap-distance-right:9pt;mso-wrap-distance-bottom:0;mso-position-horizontal:absolute;mso-position-horizontal-relative:text;mso-position-vertical:absolute;mso-position-vertical-relative:text;v-text-anchor:top" o:gfxdata="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" filled="f" stroked="f">
+                <v:textbox style="mso-fit-shape-to-text:t" inset="0,0,0,0">
+                  <w:txbxContent>
+                    <w:p>
+                      <w:pPr>
+                        <w:pStyle w:val="Descripcin"/>
+                        <w:rPr>
+                          <w:noProof/>
+                          <w:color w:val="000000"/>
+                        </w:rPr>
+                      </w:pPr>
+                      <w:bookmarkStart w:id="7" w:name="_Toc240063241"/>
+                      <w:r>
+                        <w:t xml:space="preserve">Ilustración </w:t>
+                      </w:r>
+                      <w:fldSimple w:instr=" SEQ Ilustración \* ARABIC ">
+                        <w:r>
+                          <w:rPr>
+                            <w:noProof/>
+                          </w:rPr>
+                          <w:t>2</w:t>
+                        </w:r>
+                      </w:fldSimple>
+                      <w:r>
+                        <w:t>. Vista calculadora</w:t>
+                      </w:r>
+                      <w:bookmarkEnd w:id="7"/>
+                    </w:p>
+                  </w:txbxContent>
+                </v:textbox>
+                <w10:wrap type="topAndBottom"/>
+              </v:shape>
+            </w:pict>
+          </mc:Fallback>
+        </mc:AlternateContent>
+      </w:r>
+      <w:r>
+        <w:rPr>
+          <w:noProof/>
+        </w:rPr>
+        <w:drawing>
+          <wp:anchor distT="0" distB="0" distL="114300" distR="114300" simplePos="0" relativeHeight="251687424" behindDoc="0" locked="0" layoutInCell="1" allowOverlap="1" wp14:anchorId="475DD29B" wp14:editId="10CE0254">
+            <wp:simplePos x="0" y="0"/>
+            <wp:positionH relativeFrom="margin">
+              <wp:posOffset>1214755</wp:posOffset>
+            </wp:positionH>
+            <wp:positionV relativeFrom="margin">
+              <wp:posOffset>660612</wp:posOffset>
+            </wp:positionV>
+            <wp:extent cx="3378200" cy="6459855"/>
+            <wp:effectExtent l="0" t="0" r="0" b="0"/>
+            <wp:wrapTopAndBottom/>
+            <wp:docPr id="1398636089" name="Imagen 8"/>
+            <wp:cNvGraphicFramePr>
+              <a:graphicFrameLocks xmlns:a="http://schemas.openxmlformats.org/drawingml/2006/main" noChangeAspect="1"/>
+            </wp:cNvGraphicFramePr>
+            <a:graphic xmlns:a="http://schemas.openxmlformats.org/drawingml/2006/main">
+              <a:graphicData uri="http://schemas.openxmlformats.org/drawingml/2006/picture">
+                <pic:pic xmlns:pic="http://schemas.openxmlformats.org/drawingml/2006/picture">
+                  <pic:nvPicPr>
+                    <pic:cNvPr id="0" name="Picture 2"/>
+                    <pic:cNvPicPr>
+                      <a:picLocks noChangeAspect="1" noChangeArrowheads="1"/>
+                    </pic:cNvPicPr>
+                  </pic:nvPicPr>
+                  <pic:blipFill>
+                    <a:blip r:embed="rId13">
+                      <a:extLst>
+                        <a:ext uri="{28A0092B-C50C-407E-A947-70E740481C1C}">
+                          <a14:useLocalDpi xmlns:a14="http://schemas.microsoft.com/office/drawing/2010/main" val="0"/>
+                        </a:ext>
+                      </a:extLst>
+                    </a:blip>
+                    <a:srcRect/>
+                    <a:stretch>
+                      <a:fillRect/>
+                    </a:stretch>
+                  </pic:blipFill>
+                  <pic:spPr bwMode="auto">
+                    <a:xfrm>
+                      <a:off x="0" y="0"/>
+                      <a:ext cx="3378200" cy="6459855"/>
+                    </a:xfrm>
+                    <a:prstGeom prst="rect">
+                      <a:avLst/>
+                    </a:prstGeom>
+                    <a:noFill/>
+                    <a:ln>
+                      <a:noFill/>
+                    </a:ln>
+                  </pic:spPr>
+                </pic:pic>
+              </a:graphicData>
+            </a:graphic>
+          </wp:anchor>
+        </w:drawing>
+      </w:r>
+      <w:r>
+        <w:tab/>
+      </w:r>
+      <w:r>
+        <w:t xml:space="preserve">Para los nombres de las variables de elementos en pantalla se está utilizando la convención </w:t>
+      </w:r>
+      <w:r>
+        <w:rPr>
+          <w:i/>
+          <w:iCs/>
+        </w:rPr>
+        <w:t>Camel Case</w:t>
+      </w:r>
+      <w:r>
+        <w:rPr>
+          <w:i/>
+          <w:iCs/>
+        </w:rPr>
+        <w:t xml:space="preserve">, </w:t>
+      </w:r>
+      <w:r>
+        <w:t>y todas especifican el tipo de elemento que son, por ejemplo: btnSumar, lblResultado, txtPrimerDato.</w:t>
+      </w:r>
+    </w:p>
+    <w:p>
+      <w:pPr>
+        <w:pStyle w:val="Ttulo2"/>
+      </w:pPr>
+      <w:bookmarkStart w:id="8" w:name="_Toc240063238"/>
+      <w:r>
+        <w:t>Clase</w:t>
+      </w:r>
+      <w:bookmarkEnd w:id="8"/>
+    </w:p>
+    <w:p>
+      <w:r>
+        <w:tab/>
+        <w:t xml:space="preserve">Dentro de su clase controladora correspondiente se encuentra la definición y recolección de todos los elementos de la vista opción que son necesarios, como lo </w:t>
+      </w:r>
+      <w:r>
+        <w:lastRenderedPageBreak/>
+        <w:t xml:space="preserve">puede ser: los elementos para editar texto, botones y la etiqueta de texto que muestra el resultado. </w:t>
+      </w:r>
+    </w:p>
+    <w:p>
+      <w:pPr>
+        <w:keepNext/>
+      </w:pPr>
+      <w:r>
+        <w:rPr>
+          <w:noProof/>
+        </w:rPr>
+        <w:drawing>
+          <wp:inline distT="0" distB="0" distL="0" distR="0" wp14:anchorId="6AD3F553" wp14:editId="07E55D6D">
+            <wp:extent cx="5791200" cy="3708400"/>
+            <wp:effectExtent l="0" t="0" r="0" b="6350"/>
+            <wp:docPr id="534006759" name="Imagen 9"/>
+            <wp:cNvGraphicFramePr>
+              <a:graphicFrameLocks xmlns:a="http://schemas.openxmlformats.org/drawingml/2006/main" noChangeAspect="1"/>
+            </wp:cNvGraphicFramePr>
+            <a:graphic xmlns:a="http://schemas.openxmlformats.org/drawingml/2006/main">
+              <a:graphicData uri="http://schemas.openxmlformats.org/drawingml/2006/picture">
+                <pic:pic xmlns:pic="http://schemas.openxmlformats.org/drawingml/2006/picture">
+                  <pic:nvPicPr>
+                    <pic:cNvPr id="0" name="Picture 3"/>
+                    <pic:cNvPicPr>
+                      <a:picLocks noChangeAspect="1" noChangeArrowheads="1"/>
+                    </pic:cNvPicPr>
+                  </pic:nvPicPr>
+                  <pic:blipFill>
+                    <a:blip r:embed="rId14">
+                      <a:extLst>
+                        <a:ext uri="{28A0092B-C50C-407E-A947-70E740481C1C}">
+                          <a14:useLocalDpi xmlns:a14="http://schemas.microsoft.com/office/drawing/2010/main" val="0"/>
+                        </a:ext>
+                      </a:extLst>
+                    </a:blip>
+                    <a:srcRect/>
+                    <a:stretch>
+                      <a:fillRect/>
+                    </a:stretch>
+                  </pic:blipFill>
+                  <pic:spPr bwMode="auto">
+                    <a:xfrm>
+                      <a:off x="0" y="0"/>
+                      <a:ext cx="5791200" cy="3708400"/>
+                    </a:xfrm>
+                    <a:prstGeom prst="rect">
+                      <a:avLst/>
+                    </a:prstGeom>
+                    <a:noFill/>
+                    <a:ln>
+                      <a:noFill/>
+                    </a:ln>
+                  </pic:spPr>
+                </pic:pic>
+              </a:graphicData>
+            </a:graphic>
+          </wp:inline>
+        </w:drawing>
+      </w:r>
+    </w:p>
+    <w:p>
+      <w:pPr>
+        <w:pStyle w:val="Descripcin"/>
+      </w:pPr>
+      <w:bookmarkStart w:id="9" w:name="_Toc240063242"/>
+      <w:r>
+        <w:t xml:space="preserve">Ilustración </w:t>
+      </w:r>
+      <w:fldSimple w:instr=" SEQ Ilustración \* ARABIC ">
+        <w:r>
+          <w:rPr>
+            <w:noProof/>
+          </w:rPr>
+          <w:t>3</w:t>
+        </w:r>
+      </w:fldSimple>
+      <w:r>
+        <w:t>. Clase "Opcion" – asignaciones</w:t>
+      </w:r>
+      <w:bookmarkEnd w:id="9"/>
+    </w:p>
+    <w:p>
+      <w:r>
+        <w:tab/>
+        <w:t xml:space="preserve">La función </w:t>
+      </w:r>
+      <w:r>
+        <w:rPr>
+          <w:i/>
+          <w:iCs/>
+        </w:rPr>
+        <w:t xml:space="preserve">onClick </w:t>
+      </w:r>
+      <w:r>
+        <w:t>cuenta con una estructura más grande y está a cargo de la función de todos los botones. Y se ejecuta de la forma:</w:t>
+      </w:r>
+    </w:p>
+    <w:p>
+      <w:pPr>
+        <w:pStyle w:val="Prrafodelista"/>
+        <w:numPr>
+          <w:ilvl w:val="0"/>
+          <w:numId w:val="33"/>
+        </w:numPr>
+      </w:pPr>
+      <w:r>
+        <w:t xml:space="preserve">Verifica si el botón llamado fue </w:t>
+      </w:r>
+      <w:r>
+        <w:rPr>
+          <w:i/>
+          <w:iCs/>
+        </w:rPr>
+        <w:t>Limpiar</w:t>
+      </w:r>
+      <w:r>
+        <w:t>, si es así entonces limpia las entradas y la etiqueta del resultado para después volver.</w:t>
+      </w:r>
+    </w:p>
+    <w:p>
+      <w:pPr>
+        <w:pStyle w:val="Prrafodelista"/>
+        <w:numPr>
+          <w:ilvl w:val="0"/>
+          <w:numId w:val="33"/>
+        </w:numPr>
+      </w:pPr>
+      <w:r>
+        <w:t>Obtiene los valores de ambos operandos, los transforma en cadenas de caracteres y limpia espacios al inicio o final que puedan existir.</w:t>
+      </w:r>
+    </w:p>
+    <w:p>
+      <w:pPr>
+        <w:pStyle w:val="Prrafodelista"/>
+        <w:numPr>
+          <w:ilvl w:val="0"/>
+          <w:numId w:val="33"/>
+        </w:numPr>
+      </w:pPr>
+      <w:r>
+        <w:t xml:space="preserve">Verifica si alguna entrada está vacía, si alguna lo está, lanza un mensaje al usuario por medio de un </w:t>
+      </w:r>
+      <w:r>
+        <w:rPr>
+          <w:i/>
+          <w:iCs/>
+        </w:rPr>
+        <w:t>Toast</w:t>
+      </w:r>
+      <w:r>
+        <w:t>.</w:t>
+      </w:r>
+    </w:p>
+    <w:p>
+      <w:pPr>
+        <w:pStyle w:val="Prrafodelista"/>
+        <w:numPr>
+          <w:ilvl w:val="0"/>
+          <w:numId w:val="33"/>
+        </w:numPr>
+      </w:pPr>
+      <w:r>
+        <w:t>Una vez que validó las entradas, entra en el bloque sensible try-catch para hacer la conversión de valores de tipo carácter a entero. Si la función lanza una excepción de tipo formato de número, entonces el programa lanza un mensaje al usuario para indicarle que solo debe ingresar caracteres numéricos.</w:t>
+      </w:r>
+    </w:p>
+    <w:p>
+      <w:pPr>
+        <w:pStyle w:val="Prrafodelista"/>
+        <w:numPr>
+          <w:ilvl w:val="0"/>
+          <w:numId w:val="33"/>
+        </w:numPr>
+      </w:pPr>
+      <w:r>
+        <w:t>Al salir del bloque sensible, el código se dedica a verificar que operación se llamó a hacer, la ejecuta y guarda el resultado.</w:t>
+      </w:r>
+    </w:p>
+    <w:p>
+      <w:pPr>
+        <w:pStyle w:val="Prrafodelista"/>
+        <w:numPr>
+          <w:ilvl w:val="1"/>
+          <w:numId w:val="33"/>
+        </w:numPr>
+      </w:pPr>
+      <w:r>
+        <w:t>Si la operación fue división, entonces el programa realizará una verificación extra con el segundo operando. Si es cero, entonces lanzará un mensaje advirtiendo al usuario de que la operación no se puede llevar a cabo y retorna, sino realiza la operación.</w:t>
+      </w:r>
+    </w:p>
+    <w:p>
+      <w:pPr>
+        <w:pStyle w:val="Prrafodelista"/>
+        <w:numPr>
+          <w:ilvl w:val="0"/>
+          <w:numId w:val="33"/>
+        </w:numPr>
+      </w:pPr>
+      <w:r>
+        <w:lastRenderedPageBreak/>
+        <w:t>Para finalizar, el resultado se ingresa en la etiqueta de resultado al convertir el valor en tipo carácter.</w:t>
+      </w:r>
+    </w:p>
+    <w:p>
+      <w:pPr>
+        <w:keepNext/>
+      </w:pPr>
+      <w:r>
+        <w:rPr>
+          <w:noProof/>
+        </w:rPr>
+        <w:drawing>
+          <wp:inline distT="0" distB="0" distL="0" distR="0" wp14:anchorId="5E63A1B3" wp14:editId="3A03EDCC">
+            <wp:extent cx="5781675" cy="3457575"/>
+            <wp:effectExtent l="0" t="0" r="9525" b="9525"/>
+            <wp:docPr id="586127851" name="Imagen 10"/>
+            <wp:cNvGraphicFramePr>
+              <a:graphicFrameLocks xmlns:a="http://schemas.openxmlformats.org/drawingml/2006/main" noChangeAspect="1"/>
+            </wp:cNvGraphicFramePr>
+            <a:graphic xmlns:a="http://schemas.openxmlformats.org/drawingml/2006/main">
+              <a:graphicData uri="http://schemas.openxmlformats.org/drawingml/2006/picture">
+                <pic:pic xmlns:pic="http://schemas.openxmlformats.org/drawingml/2006/picture">
+                  <pic:nvPicPr>
+                    <pic:cNvPr id="0" name="Picture 4"/>
+                    <pic:cNvPicPr>
+                      <a:picLocks noChangeAspect="1" noChangeArrowheads="1"/>
+                    </pic:cNvPicPr>
+                  </pic:nvPicPr>
+                  <pic:blipFill>
+                    <a:blip r:embed="rId15">
+                      <a:extLst>
+                        <a:ext uri="{28A0092B-C50C-407E-A947-70E740481C1C}">
+                          <a14:useLocalDpi xmlns:a14="http://schemas.microsoft.com/office/drawing/2010/main" val="0"/>
+                        </a:ext>
+                      </a:extLst>
+                    </a:blip>
+                    <a:srcRect/>
+                    <a:stretch>
+                      <a:fillRect/>
+                    </a:stretch>
+                  </pic:blipFill>
+                  <pic:spPr bwMode="auto">
+                    <a:xfrm>
+                      <a:off x="0" y="0"/>
+                      <a:ext cx="5781675" cy="3457575"/>
+                    </a:xfrm>
+                    <a:prstGeom prst="rect">
+                      <a:avLst/>
+                    </a:prstGeom>
+                    <a:noFill/>
+                    <a:ln>
+                      <a:noFill/>
+                    </a:ln>
+                  </pic:spPr>
+                </pic:pic>
+              </a:graphicData>
+            </a:graphic>
+          </wp:inline>
+        </w:drawing>
+      </w:r>
+      <w:r>
+        <w:t xml:space="preserve"> </w:t>
+      </w:r>
+      <w:r>
+        <w:rPr>
+          <w:noProof/>
+        </w:rPr>
+        <w:drawing>
+          <wp:inline distT="0" distB="0" distL="0" distR="0" wp14:anchorId="395BC482" wp14:editId="1685417E">
+            <wp:extent cx="5791200" cy="2295525"/>
+            <wp:effectExtent l="0" t="0" r="0" b="9525"/>
+            <wp:docPr id="415769499" name="Imagen 11"/>
+            <wp:cNvGraphicFramePr>
+              <a:graphicFrameLocks xmlns:a="http://schemas.openxmlformats.org/drawingml/2006/main" noChangeAspect="1"/>
+            </wp:cNvGraphicFramePr>
+            <a:graphic xmlns:a="http://schemas.openxmlformats.org/drawingml/2006/main">
+              <a:graphicData uri="http://schemas.openxmlformats.org/drawingml/2006/picture">
+                <pic:pic xmlns:pic="http://schemas.openxmlformats.org/drawingml/2006/picture">
+                  <pic:nvPicPr>
+                    <pic:cNvPr id="0" name="Picture 5"/>
+                    <pic:cNvPicPr>
+                      <a:picLocks noChangeAspect="1" noChangeArrowheads="1"/>
+                    </pic:cNvPicPr>
+                  </pic:nvPicPr>
+                  <pic:blipFill>
+                    <a:blip r:embed="rId16">
+                      <a:extLst>
+                        <a:ext uri="{28A0092B-C50C-407E-A947-70E740481C1C}">
+                          <a14:useLocalDpi xmlns:a14="http://schemas.microsoft.com/office/drawing/2010/main" val="0"/>
+                        </a:ext>
+                      </a:extLst>
+                    </a:blip>
+                    <a:srcRect/>
+                    <a:stretch>
+                      <a:fillRect/>
+                    </a:stretch>
+                  </pic:blipFill>
+                  <pic:spPr bwMode="auto">
+                    <a:xfrm>
+                      <a:off x="0" y="0"/>
+                      <a:ext cx="5791200" cy="2295525"/>
+                    </a:xfrm>
+                    <a:prstGeom prst="rect">
+                      <a:avLst/>
+                    </a:prstGeom>
+                    <a:noFill/>
+                    <a:ln>
+                      <a:noFill/>
+                    </a:ln>
+                  </pic:spPr>
+                </pic:pic>
+              </a:graphicData>
+            </a:graphic>
+          </wp:inline>
+        </w:drawing>
+      </w:r>
+    </w:p>
+    <w:p>
+      <w:pPr>
+        <w:pStyle w:val="Descripcin"/>
+      </w:pPr>
+      <w:bookmarkStart w:id="10" w:name="_Toc240063243"/>
+      <w:r>
+        <w:t xml:space="preserve">Ilustración </w:t>
+      </w:r>
+      <w:fldSimple w:instr=" SEQ Ilustración \* ARABIC ">
+        <w:r>
+          <w:rPr>
+            <w:noProof/>
+          </w:rPr>
+          <w:t>4</w:t>
+        </w:r>
+      </w:fldSimple>
+      <w:r>
+        <w:t>. método "onClick"</w:t>
+      </w:r>
+      <w:bookmarkEnd w:id="10"/>
+    </w:p>
+    <w:p>
+      <w:pPr>
+        <w:pStyle w:val="Ttulo1"/>
+      </w:pPr>
+      <w:bookmarkStart w:id="11" w:name="_Toc240063239"/>
+      <w:r>
+        <w:t>Bibliografía</w:t>
+      </w:r>
+      <w:bookmarkEnd w:id="11"/>
+    </w:p>
+    <w:p>
+      <w:pPr>
+        <w:pStyle w:val="Prrafodelista"/>
+        <w:numPr>
+          <w:ilvl w:val="0"/>
+          <w:numId w:val="34"/>
+        </w:numPr>
+      </w:pPr>
+      <w:r>
+        <w:t>Android API reference. (s/f). Recuperado el 1</w:t>
+      </w:r>
+      <w:r>
+        <w:t>1</w:t>
+      </w:r>
+      <w:r>
+        <w:t xml:space="preserve"> de septiembre de 2026, de Android Developers website: </w:t>
+      </w:r>
+      <w:hyperlink r:id="rId17" w:history="1">
+        <w:r>
+          <w:rPr>
+            <w:rStyle w:val="Hipervnculo"/>
+          </w:rPr>
+          <w:t>https://developer.android.com/reference</w:t>
+        </w:r>
+      </w:hyperlink>
+      <w:r>
+        <w:t xml:space="preserve"> </w:t>
       </w:r>
     </w:p>
     <w:p/>
-    <w:p/>
-    <w:p>
-      <w:pPr>
-        <w:jc w:val="left"/>
-      </w:pPr>
-      <w:r>
-        <w:t xml:space="preserve">Nombre del archivo: </w:t>
-      </w:r>
-      <w:r>
-        <w:br/>
-      </w:r>
-      <w:proofErr w:type="spellStart"/>
-      <w:r>
-        <w:t>QuijasContrerasVictorManuel</w:t>
-      </w:r>
-      <w:proofErr w:type="spellEnd"/>
-      <w:r>
-        <w:t>[Fecha][Tipo de actividad]#[número].</w:t>
-      </w:r>
-    </w:p>
-    <w:p/>
-    <w:p/>
-    <w:p/>
-    <w:p/>
-    <w:p/>
-    <w:p/>
-    <w:p/>
-    <w:p/>
-    <w:p/>
-    <w:p/>
     <w:sectPr>
-      <w:headerReference w:type="even" r:id="rId12"/>
-      <w:headerReference w:type="default" r:id="rId13"/>
-      <w:footerReference w:type="even" r:id="rId14"/>
-      <w:footerReference w:type="default" r:id="rId15"/>
+      <w:headerReference w:type="even" r:id="rId18"/>
+      <w:headerReference w:type="default" r:id="rId19"/>
+      <w:footerReference w:type="even" r:id="rId20"/>
+      <w:footerReference w:type="default" r:id="rId21"/>
       <w:pgSz w:w="12240" w:h="15840"/>
       <w:pgMar w:top="1418" w:right="1134" w:bottom="1418" w:left="1701" w:header="720" w:footer="720" w:gutter="284"/>
       <w:pgBorders w:offsetFrom="page">
@@ -1947,7 +3111,7 @@
 </file>
 
 <file path=word/endnotes.xml><?xml version="1.0" encoding="utf-8"?>
-<w:endnotes xmlns:wpc="http://schemas.microsoft.com/office/word/2010/wordprocessingCanvas" xmlns:cx="http://schemas.microsoft.com/office/drawing/2014/chartex" xmlns:cx1="http://schemas.microsoft.com/office/drawing/2015/9/8/chartex" xmlns:cx2="http://schemas.microsoft.com/office/drawing/2015/10/21/chartex" xmlns:cx3="http://schemas.microsoft.com/office/drawing/2016/5/9/chartex" xmlns:cx4="http://schemas.microsoft.com/office/drawing/2016/5/10/chartex" xmlns:cx5="http://schemas.microsoft.com/office/drawing/2016/5/11/chartex" xmlns:cx6="http://schemas.microsoft.com/office/drawing/2016/5/12/chartex" xmlns:cx7="http://schemas.microsoft.com/office/drawing/2016/5/13/chartex" xmlns:cx8="http://schemas.microsoft.com/office/drawing/2016/5/14/chartex" xmlns:mc="http://schemas.openxmlformats.org/markup-compatibility/2006" xmlns:aink="http://schemas.microsoft.com/office/drawing/2016/ink" xmlns:am3d="http://schemas.microsoft.com/office/drawing/2017/model3d" xmlns:o="urn:schemas-microsoft-com:office:office" xmlns:oel="http://schemas.microsoft.com/office/2019/extlst" xmlns:r="http://schemas.openxmlformats.org/officeDocument/2006/relationships" xmlns:m="http://schemas.openxmlformats.org/officeDocument/2006/math" xmlns:v="urn:schemas-microsoft-com:vml" xmlns:wp14="http://schemas.microsoft.com/office/word/2010/wordprocessingDrawing" xmlns:wp="http://schemas.openxmlformats.org/drawingml/2006/wordprocessingDrawing" xmlns:w10="urn:schemas-microsoft-com:office:word" xmlns:w="http://schemas.openxmlformats.org/wordprocessingml/2006/main" xmlns:w14="http://schemas.microsoft.com/office/word/2010/wordml" xmlns:w15="http://schemas.microsoft.com/office/word/2012/wordml" xmlns:w16cei="http://schemas.microsoft.com/office/word/2026/wordml/cei" xmlns:w16cex="http://schemas.microsoft.com/office/word/2018/wordml/cex" xmlns:w16cid="http://schemas.microsoft.com/office/word/2016/wordml/cid" xmlns:w16="http://schemas.microsoft.com/office/word/2018/wordml" xmlns:w16du="http://schemas.microsoft.com/office/word/2023/wordml/word16du" xmlns:w16sdtdh="http://schemas.microsoft.com/office/word/2020/wordml/sdtdatahash" xmlns:w16sdtfl="http://schemas.microsoft.com/office/word/2024/wordml/sdtformatlock" xmlns:w16se="http://schemas.microsoft.com/office/word/2015/wordml/symex" xmlns:wpg="http://schemas.microsoft.com/office/word/2010/wordprocessingGroup" xmlns:wpi="http://schemas.microsoft.com/office/word/2010/wordprocessingInk" xmlns:wne="http://schemas.microsoft.com/office/word/2006/wordml" xmlns:wps="http://schemas.microsoft.com/office/word/2010/wordprocessingShape" mc:Ignorable="w14 w15 w16se w16cid w16 w16cex w16sdtdh w16sdtfl w16du wp14">
+<w:endnotes xmlns:wpc="http://schemas.microsoft.com/office/word/2010/wordprocessingCanvas" xmlns:cx="http://schemas.microsoft.com/office/drawing/2014/chartex" xmlns:cx1="http://schemas.microsoft.com/office/drawing/2015/9/8/chartex" xmlns:cx2="http://schemas.microsoft.com/office/drawing/2015/10/21/chartex" xmlns:cx3="http://schemas.microsoft.com/office/drawing/2016/5/9/chartex" xmlns:cx4="http://schemas.microsoft.com/office/drawing/2016/5/10/chartex" xmlns:cx5="http://schemas.microsoft.com/office/drawing/2016/5/11/chartex" xmlns:cx6="http://schemas.microsoft.com/office/drawing/2016/5/12/chartex" xmlns:cx7="http://schemas.microsoft.com/office/drawing/2016/5/13/chartex" xmlns:cx8="http://schemas.microsoft.com/office/drawing/2016/5/14/chartex" xmlns:mc="http://schemas.openxmlformats.org/markup-compatibility/2006" xmlns:aink="http://schemas.microsoft.com/office/drawing/2016/ink" xmlns:am3d="http://schemas.microsoft.com/office/drawing/2017/model3d" xmlns:o="urn:schemas-microsoft-com:office:office" xmlns:oel="http://schemas.microsoft.com/office/2019/extlst" xmlns:r="http://schemas.openxmlformats.org/officeDocument/2006/relationships" xmlns:m="http://schemas.openxmlformats.org/officeDocument/2006/math" xmlns:v="urn:schemas-microsoft-com:vml" xmlns:wp14="http://schemas.microsoft.com/office/word/2010/wordprocessingDrawing" xmlns:wp="http://schemas.openxmlformats.org/drawingml/2006/wordprocessingDrawing" xmlns:w10="urn:schemas-microsoft-com:office:word" xmlns:w="http://schemas.openxmlformats.org/wordprocessingml/2006/main" xmlns:w14="http://schemas.microsoft.com/office/word/2010/wordml" xmlns:w15="http://schemas.microsoft.com/office/word/2012/wordml" xmlns:w16cex="http://schemas.microsoft.com/office/word/2018/wordml/cex" xmlns:w16cid="http://schemas.microsoft.com/office/word/2016/wordml/cid" xmlns:w16="http://schemas.microsoft.com/office/word/2018/wordml" xmlns:w16du="http://schemas.microsoft.com/office/word/2023/wordml/word16du" xmlns:w16sdtdh="http://schemas.microsoft.com/office/word/2020/wordml/sdtdatahash" xmlns:w16sdtfl="http://schemas.microsoft.com/office/word/2024/wordml/sdtformatlock" xmlns:w16se="http://schemas.microsoft.com/office/word/2015/wordml/symex" xmlns:wpg="http://schemas.microsoft.com/office/word/2010/wordprocessingGroup" xmlns:wpi="http://schemas.microsoft.com/office/word/2010/wordprocessingInk" xmlns:wne="http://schemas.microsoft.com/office/word/2006/wordml" xmlns:wps="http://schemas.microsoft.com/office/word/2010/wordprocessingShape" mc:Ignorable="w14 w15 w16se w16cid w16 w16cex w16sdtdh w16sdtfl w16du wp14">
   <w:endnote w:type="separator" w:id="-1">
     <w:p>
       <w:pPr>
@@ -1972,7 +3136,7 @@
 </file>
 
 <file path=word/footer1.xml><?xml version="1.0" encoding="utf-8"?>
-<w:ftr xmlns:wpc="http://schemas.microsoft.com/office/word/2010/wordprocessingCanvas" xmlns:cx="http://schemas.microsoft.com/office/drawing/2014/chartex" xmlns:cx1="http://schemas.microsoft.com/office/drawing/2015/9/8/chartex" xmlns:cx2="http://schemas.microsoft.com/office/drawing/2015/10/21/chartex" xmlns:cx3="http://schemas.microsoft.com/office/drawing/2016/5/9/chartex" xmlns:cx4="http://schemas.microsoft.com/office/drawing/2016/5/10/chartex" xmlns:cx5="http://schemas.microsoft.com/office/drawing/2016/5/11/chartex" xmlns:cx6="http://schemas.microsoft.com/office/drawing/2016/5/12/chartex" xmlns:cx7="http://schemas.microsoft.com/office/drawing/2016/5/13/chartex" xmlns:cx8="http://schemas.microsoft.com/office/drawing/2016/5/14/chartex" xmlns:mc="http://schemas.openxmlformats.org/markup-compatibility/2006" xmlns:aink="http://schemas.microsoft.com/office/drawing/2016/ink" xmlns:am3d="http://schemas.microsoft.com/office/drawing/2017/model3d" xmlns:o="urn:schemas-microsoft-com:office:office" xmlns:oel="http://schemas.microsoft.com/office/2019/extlst" xmlns:r="http://schemas.openxmlformats.org/officeDocument/2006/relationships" xmlns:m="http://schemas.openxmlformats.org/officeDocument/2006/math" xmlns:v="urn:schemas-microsoft-com:vml" xmlns:wp14="http://schemas.microsoft.com/office/word/2010/wordprocessingDrawing" xmlns:wp="http://schemas.openxmlformats.org/drawingml/2006/wordprocessingDrawing" xmlns:w10="urn:schemas-microsoft-com:office:word" xmlns:w="http://schemas.openxmlformats.org/wordprocessingml/2006/main" xmlns:w14="http://schemas.microsoft.com/office/word/2010/wordml" xmlns:w15="http://schemas.microsoft.com/office/word/2012/wordml" xmlns:w16cei="http://schemas.microsoft.com/office/word/2026/wordml/cei" xmlns:w16cex="http://schemas.microsoft.com/office/word/2018/wordml/cex" xmlns:w16cid="http://schemas.microsoft.com/office/word/2016/wordml/cid" xmlns:w16="http://schemas.microsoft.com/office/word/2018/wordml" xmlns:w16du="http://schemas.microsoft.com/office/word/2023/wordml/word16du" xmlns:w16sdtdh="http://schemas.microsoft.com/office/word/2020/wordml/sdtdatahash" xmlns:w16sdtfl="http://schemas.microsoft.com/office/word/2024/wordml/sdtformatlock" xmlns:w16se="http://schemas.microsoft.com/office/word/2015/wordml/symex" xmlns:wpg="http://schemas.microsoft.com/office/word/2010/wordprocessingGroup" xmlns:wpi="http://schemas.microsoft.com/office/word/2010/wordprocessingInk" xmlns:wne="http://schemas.microsoft.com/office/word/2006/wordml" xmlns:wps="http://schemas.microsoft.com/office/word/2010/wordprocessingShape" mc:Ignorable="w14 w15 w16se w16cid w16 w16cex w16sdtdh w16sdtfl w16du wp14">
+<w:ftr xmlns:wpc="http://schemas.microsoft.com/office/word/2010/wordprocessingCanvas" xmlns:cx="http://schemas.microsoft.com/office/drawing/2014/chartex" xmlns:cx1="http://schemas.microsoft.com/office/drawing/2015/9/8/chartex" xmlns:cx2="http://schemas.microsoft.com/office/drawing/2015/10/21/chartex" xmlns:cx3="http://schemas.microsoft.com/office/drawing/2016/5/9/chartex" xmlns:cx4="http://schemas.microsoft.com/office/drawing/2016/5/10/chartex" xmlns:cx5="http://schemas.microsoft.com/office/drawing/2016/5/11/chartex" xmlns:cx6="http://schemas.microsoft.com/office/drawing/2016/5/12/chartex" xmlns:cx7="http://schemas.microsoft.com/office/drawing/2016/5/13/chartex" xmlns:cx8="http://schemas.microsoft.com/office/drawing/2016/5/14/chartex" xmlns:mc="http://schemas.openxmlformats.org/markup-compatibility/2006" xmlns:aink="http://schemas.microsoft.com/office/drawing/2016/ink" xmlns:am3d="http://schemas.microsoft.com/office/drawing/2017/model3d" xmlns:o="urn:schemas-microsoft-com:office:office" xmlns:oel="http://schemas.microsoft.com/office/2019/extlst" xmlns:r="http://schemas.openxmlformats.org/officeDocument/2006/relationships" xmlns:m="http://schemas.openxmlformats.org/officeDocument/2006/math" xmlns:v="urn:schemas-microsoft-com:vml" xmlns:wp14="http://schemas.microsoft.com/office/word/2010/wordprocessingDrawing" xmlns:wp="http://schemas.openxmlformats.org/drawingml/2006/wordprocessingDrawing" xmlns:w10="urn:schemas-microsoft-com:office:word" xmlns:w="http://schemas.openxmlformats.org/wordprocessingml/2006/main" xmlns:w14="http://schemas.microsoft.com/office/word/2010/wordml" xmlns:w15="http://schemas.microsoft.com/office/word/2012/wordml" xmlns:w16cex="http://schemas.microsoft.com/office/word/2018/wordml/cex" xmlns:w16cid="http://schemas.microsoft.com/office/word/2016/wordml/cid" xmlns:w16="http://schemas.microsoft.com/office/word/2018/wordml" xmlns:w16du="http://schemas.microsoft.com/office/word/2023/wordml/word16du" xmlns:w16sdtdh="http://schemas.microsoft.com/office/word/2020/wordml/sdtdatahash" xmlns:w16sdtfl="http://schemas.microsoft.com/office/word/2024/wordml/sdtformatlock" xmlns:w16se="http://schemas.microsoft.com/office/word/2015/wordml/symex" xmlns:wpg="http://schemas.microsoft.com/office/word/2010/wordprocessingGroup" xmlns:wpi="http://schemas.microsoft.com/office/word/2010/wordprocessingInk" xmlns:wne="http://schemas.microsoft.com/office/word/2006/wordml" xmlns:wps="http://schemas.microsoft.com/office/word/2010/wordprocessingShape" mc:Ignorable="w14 w15 w16se w16cid w16 w16cex w16sdtdh w16sdtfl w16du wp14">
   <w:sdt>
     <w:sdtPr>
       <w:rPr>
@@ -2064,7 +3228,7 @@
 </file>
 
 <file path=word/footer2.xml><?xml version="1.0" encoding="utf-8"?>
-<w:ftr xmlns:wpc="http://schemas.microsoft.com/office/word/2010/wordprocessingCanvas" xmlns:cx="http://schemas.microsoft.com/office/drawing/2014/chartex" xmlns:cx1="http://schemas.microsoft.com/office/drawing/2015/9/8/chartex" xmlns:cx2="http://schemas.microsoft.com/office/drawing/2015/10/21/chartex" xmlns:cx3="http://schemas.microsoft.com/office/drawing/2016/5/9/chartex" xmlns:cx4="http://schemas.microsoft.com/office/drawing/2016/5/10/chartex" xmlns:cx5="http://schemas.microsoft.com/office/drawing/2016/5/11/chartex" xmlns:cx6="http://schemas.microsoft.com/office/drawing/2016/5/12/chartex" xmlns:cx7="http://schemas.microsoft.com/office/drawing/2016/5/13/chartex" xmlns:cx8="http://schemas.microsoft.com/office/drawing/2016/5/14/chartex" xmlns:mc="http://schemas.openxmlformats.org/markup-compatibility/2006" xmlns:aink="http://schemas.microsoft.com/office/drawing/2016/ink" xmlns:am3d="http://schemas.microsoft.com/office/drawing/2017/model3d" xmlns:o="urn:schemas-microsoft-com:office:office" xmlns:oel="http://schemas.microsoft.com/office/2019/extlst" xmlns:r="http://schemas.openxmlformats.org/officeDocument/2006/relationships" xmlns:m="http://schemas.openxmlformats.org/officeDocument/2006/math" xmlns:v="urn:schemas-microsoft-com:vml" xmlns:wp14="http://schemas.microsoft.com/office/word/2010/wordprocessingDrawing" xmlns:wp="http://schemas.openxmlformats.org/drawingml/2006/wordprocessingDrawing" xmlns:w10="urn:schemas-microsoft-com:office:word" xmlns:w="http://schemas.openxmlformats.org/wordprocessingml/2006/main" xmlns:w14="http://schemas.microsoft.com/office/word/2010/wordml" xmlns:w15="http://schemas.microsoft.com/office/word/2012/wordml" xmlns:w16cei="http://schemas.microsoft.com/office/word/2026/wordml/cei" xmlns:w16cex="http://schemas.microsoft.com/office/word/2018/wordml/cex" xmlns:w16cid="http://schemas.microsoft.com/office/word/2016/wordml/cid" xmlns:w16="http://schemas.microsoft.com/office/word/2018/wordml" xmlns:w16du="http://schemas.microsoft.com/office/word/2023/wordml/word16du" xmlns:w16sdtdh="http://schemas.microsoft.com/office/word/2020/wordml/sdtdatahash" xmlns:w16sdtfl="http://schemas.microsoft.com/office/word/2024/wordml/sdtformatlock" xmlns:w16se="http://schemas.microsoft.com/office/word/2015/wordml/symex" xmlns:wpg="http://schemas.microsoft.com/office/word/2010/wordprocessingGroup" xmlns:wpi="http://schemas.microsoft.com/office/word/2010/wordprocessingInk" xmlns:wne="http://schemas.microsoft.com/office/word/2006/wordml" xmlns:wps="http://schemas.microsoft.com/office/word/2010/wordprocessingShape" mc:Ignorable="w14 w15 w16se w16cid w16 w16cex w16sdtdh w16sdtfl w16du wp14">
+<w:ftr xmlns:wpc="http://schemas.microsoft.com/office/word/2010/wordprocessingCanvas" xmlns:cx="http://schemas.microsoft.com/office/drawing/2014/chartex" xmlns:cx1="http://schemas.microsoft.com/office/drawing/2015/9/8/chartex" xmlns:cx2="http://schemas.microsoft.com/office/drawing/2015/10/21/chartex" xmlns:cx3="http://schemas.microsoft.com/office/drawing/2016/5/9/chartex" xmlns:cx4="http://schemas.microsoft.com/office/drawing/2016/5/10/chartex" xmlns:cx5="http://schemas.microsoft.com/office/drawing/2016/5/11/chartex" xmlns:cx6="http://schemas.microsoft.com/office/drawing/2016/5/12/chartex" xmlns:cx7="http://schemas.microsoft.com/office/drawing/2016/5/13/chartex" xmlns:cx8="http://schemas.microsoft.com/office/drawing/2016/5/14/chartex" xmlns:mc="http://schemas.openxmlformats.org/markup-compatibility/2006" xmlns:aink="http://schemas.microsoft.com/office/drawing/2016/ink" xmlns:am3d="http://schemas.microsoft.com/office/drawing/2017/model3d" xmlns:o="urn:schemas-microsoft-com:office:office" xmlns:oel="http://schemas.microsoft.com/office/2019/extlst" xmlns:r="http://schemas.openxmlformats.org/officeDocument/2006/relationships" xmlns:m="http://schemas.openxmlformats.org/officeDocument/2006/math" xmlns:v="urn:schemas-microsoft-com:vml" xmlns:wp14="http://schemas.microsoft.com/office/word/2010/wordprocessingDrawing" xmlns:wp="http://schemas.openxmlformats.org/drawingml/2006/wordprocessingDrawing" xmlns:w10="urn:schemas-microsoft-com:office:word" xmlns:w="http://schemas.openxmlformats.org/wordprocessingml/2006/main" xmlns:w14="http://schemas.microsoft.com/office/word/2010/wordml" xmlns:w15="http://schemas.microsoft.com/office/word/2012/wordml" xmlns:w16cex="http://schemas.microsoft.com/office/word/2018/wordml/cex" xmlns:w16cid="http://schemas.microsoft.com/office/word/2016/wordml/cid" xmlns:w16="http://schemas.microsoft.com/office/word/2018/wordml" xmlns:w16du="http://schemas.microsoft.com/office/word/2023/wordml/word16du" xmlns:w16sdtdh="http://schemas.microsoft.com/office/word/2020/wordml/sdtdatahash" xmlns:w16sdtfl="http://schemas.microsoft.com/office/word/2024/wordml/sdtformatlock" xmlns:w16se="http://schemas.microsoft.com/office/word/2015/wordml/symex" xmlns:wpg="http://schemas.microsoft.com/office/word/2010/wordprocessingGroup" xmlns:wpi="http://schemas.microsoft.com/office/word/2010/wordprocessingInk" xmlns:wne="http://schemas.microsoft.com/office/word/2006/wordml" xmlns:wps="http://schemas.microsoft.com/office/word/2010/wordprocessingShape" mc:Ignorable="w14 w15 w16se w16cid w16 w16cex w16sdtdh w16sdtfl w16du wp14">
   <w:p>
     <w:pPr>
       <w:pStyle w:val="Piedepgina"/>
@@ -2091,7 +3255,7 @@
 </file>
 
 <file path=word/footnotes.xml><?xml version="1.0" encoding="utf-8"?>
-<w:footnotes xmlns:wpc="http://schemas.microsoft.com/office/word/2010/wordprocessingCanvas" xmlns:cx="http://schemas.microsoft.com/office/drawing/2014/chartex" xmlns:cx1="http://schemas.microsoft.com/office/drawing/2015/9/8/chartex" xmlns:cx2="http://schemas.microsoft.com/office/drawing/2015/10/21/chartex" xmlns:cx3="http://schemas.microsoft.com/office/drawing/2016/5/9/chartex" xmlns:cx4="http://schemas.microsoft.com/office/drawing/2016/5/10/chartex" xmlns:cx5="http://schemas.microsoft.com/office/drawing/2016/5/11/chartex" xmlns:cx6="http://schemas.microsoft.com/office/drawing/2016/5/12/chartex" xmlns:cx7="http://schemas.microsoft.com/office/drawing/2016/5/13/chartex" xmlns:cx8="http://schemas.microsoft.com/office/drawing/2016/5/14/chartex" xmlns:mc="http://schemas.openxmlformats.org/markup-compatibility/2006" xmlns:aink="http://schemas.microsoft.com/office/drawing/2016/ink" xmlns:am3d="http://schemas.microsoft.com/office/drawing/2017/model3d" xmlns:o="urn:schemas-microsoft-com:office:office" xmlns:oel="http://schemas.microsoft.com/office/2019/extlst" xmlns:r="http://schemas.openxmlformats.org/officeDocument/2006/relationships" xmlns:m="http://schemas.openxmlformats.org/officeDocument/2006/math" xmlns:v="urn:schemas-microsoft-com:vml" xmlns:wp14="http://schemas.microsoft.com/office/word/2010/wordprocessingDrawing" xmlns:wp="http://schemas.openxmlformats.org/drawingml/2006/wordprocessingDrawing" xmlns:w10="urn:schemas-microsoft-com:office:word" xmlns:w="http://schemas.openxmlformats.org/wordprocessingml/2006/main" xmlns:w14="http://schemas.microsoft.com/office/word/2010/wordml" xmlns:w15="http://schemas.microsoft.com/office/word/2012/wordml" xmlns:w16cei="http://schemas.microsoft.com/office/word/2026/wordml/cei" xmlns:w16cex="http://schemas.microsoft.com/office/word/2018/wordml/cex" xmlns:w16cid="http://schemas.microsoft.com/office/word/2016/wordml/cid" xmlns:w16="http://schemas.microsoft.com/office/word/2018/wordml" xmlns:w16du="http://schemas.microsoft.com/office/word/2023/wordml/word16du" xmlns:w16sdtdh="http://schemas.microsoft.com/office/word/2020/wordml/sdtdatahash" xmlns:w16sdtfl="http://schemas.microsoft.com/office/word/2024/wordml/sdtformatlock" xmlns:w16se="http://schemas.microsoft.com/office/word/2015/wordml/symex" xmlns:wpg="http://schemas.microsoft.com/office/word/2010/wordprocessingGroup" xmlns:wpi="http://schemas.microsoft.com/office/word/2010/wordprocessingInk" xmlns:wne="http://schemas.microsoft.com/office/word/2006/wordml" xmlns:wps="http://schemas.microsoft.com/office/word/2010/wordprocessingShape" mc:Ignorable="w14 w15 w16se w16cid w16 w16cex w16sdtdh w16sdtfl w16du wp14">
+<w:footnotes xmlns:wpc="http://schemas.microsoft.com/office/word/2010/wordprocessingCanvas" xmlns:cx="http://schemas.microsoft.com/office/drawing/2014/chartex" xmlns:cx1="http://schemas.microsoft.com/office/drawing/2015/9/8/chartex" xmlns:cx2="http://schemas.microsoft.com/office/drawing/2015/10/21/chartex" xmlns:cx3="http://schemas.microsoft.com/office/drawing/2016/5/9/chartex" xmlns:cx4="http://schemas.microsoft.com/office/drawing/2016/5/10/chartex" xmlns:cx5="http://schemas.microsoft.com/office/drawing/2016/5/11/chartex" xmlns:cx6="http://schemas.microsoft.com/office/drawing/2016/5/12/chartex" xmlns:cx7="http://schemas.microsoft.com/office/drawing/2016/5/13/chartex" xmlns:cx8="http://schemas.microsoft.com/office/drawing/2016/5/14/chartex" xmlns:mc="http://schemas.openxmlformats.org/markup-compatibility/2006" xmlns:aink="http://schemas.microsoft.com/office/drawing/2016/ink" xmlns:am3d="http://schemas.microsoft.com/office/drawing/2017/model3d" xmlns:o="urn:schemas-microsoft-com:office:office" xmlns:oel="http://schemas.microsoft.com/office/2019/extlst" xmlns:r="http://schemas.openxmlformats.org/officeDocument/2006/relationships" xmlns:m="http://schemas.openxmlformats.org/officeDocument/2006/math" xmlns:v="urn:schemas-microsoft-com:vml" xmlns:wp14="http://schemas.microsoft.com/office/word/2010/wordprocessingDrawing" xmlns:wp="http://schemas.openxmlformats.org/drawingml/2006/wordprocessingDrawing" xmlns:w10="urn:schemas-microsoft-com:office:word" xmlns:w="http://schemas.openxmlformats.org/wordprocessingml/2006/main" xmlns:w14="http://schemas.microsoft.com/office/word/2010/wordml" xmlns:w15="http://schemas.microsoft.com/office/word/2012/wordml" xmlns:w16cex="http://schemas.microsoft.com/office/word/2018/wordml/cex" xmlns:w16cid="http://schemas.microsoft.com/office/word/2016/wordml/cid" xmlns:w16="http://schemas.microsoft.com/office/word/2018/wordml" xmlns:w16du="http://schemas.microsoft.com/office/word/2023/wordml/word16du" xmlns:w16sdtdh="http://schemas.microsoft.com/office/word/2020/wordml/sdtdatahash" xmlns:w16sdtfl="http://schemas.microsoft.com/office/word/2024/wordml/sdtformatlock" xmlns:w16se="http://schemas.microsoft.com/office/word/2015/wordml/symex" xmlns:wpg="http://schemas.microsoft.com/office/word/2010/wordprocessingGroup" xmlns:wpi="http://schemas.microsoft.com/office/word/2010/wordprocessingInk" xmlns:wne="http://schemas.microsoft.com/office/word/2006/wordml" xmlns:wps="http://schemas.microsoft.com/office/word/2010/wordprocessingShape" mc:Ignorable="w14 w15 w16se w16cid w16 w16cex w16sdtdh w16sdtfl w16du wp14">
   <w:footnote w:type="separator" w:id="-1">
     <w:p>
       <w:pPr>
@@ -2116,7 +3280,7 @@
 </file>
 
 <file path=word/header1.xml><?xml version="1.0" encoding="utf-8"?>
-<w:hdr xmlns:wpc="http://schemas.microsoft.com/office/word/2010/wordprocessingCanvas" xmlns:cx="http://schemas.microsoft.com/office/drawing/2014/chartex" xmlns:cx1="http://schemas.microsoft.com/office/drawing/2015/9/8/chartex" xmlns:cx2="http://schemas.microsoft.com/office/drawing/2015/10/21/chartex" xmlns:cx3="http://schemas.microsoft.com/office/drawing/2016/5/9/chartex" xmlns:cx4="http://schemas.microsoft.com/office/drawing/2016/5/10/chartex" xmlns:cx5="http://schemas.microsoft.com/office/drawing/2016/5/11/chartex" xmlns:cx6="http://schemas.microsoft.com/office/drawing/2016/5/12/chartex" xmlns:cx7="http://schemas.microsoft.com/office/drawing/2016/5/13/chartex" xmlns:cx8="http://schemas.microsoft.com/office/drawing/2016/5/14/chartex" xmlns:mc="http://schemas.openxmlformats.org/markup-compatibility/2006" xmlns:aink="http://schemas.microsoft.com/office/drawing/2016/ink" xmlns:am3d="http://schemas.microsoft.com/office/drawing/2017/model3d" xmlns:o="urn:schemas-microsoft-com:office:office" xmlns:oel="http://schemas.microsoft.com/office/2019/extlst" xmlns:r="http://schemas.openxmlformats.org/officeDocument/2006/relationships" xmlns:m="http://schemas.openxmlformats.org/officeDocument/2006/math" xmlns:v="urn:schemas-microsoft-com:vml" xmlns:wp14="http://schemas.microsoft.com/office/word/2010/wordprocessingDrawing" xmlns:wp="http://schemas.openxmlformats.org/drawingml/2006/wordprocessingDrawing" xmlns:w10="urn:schemas-microsoft-com:office:word" xmlns:w="http://schemas.openxmlformats.org/wordprocessingml/2006/main" xmlns:w14="http://schemas.microsoft.com/office/word/2010/wordml" xmlns:w15="http://schemas.microsoft.com/office/word/2012/wordml" xmlns:w16cei="http://schemas.microsoft.com/office/word/2026/wordml/cei" xmlns:w16cex="http://schemas.microsoft.com/office/word/2018/wordml/cex" xmlns:w16cid="http://schemas.microsoft.com/office/word/2016/wordml/cid" xmlns:w16="http://schemas.microsoft.com/office/word/2018/wordml" xmlns:w16du="http://schemas.microsoft.com/office/word/2023/wordml/word16du" xmlns:w16sdtdh="http://schemas.microsoft.com/office/word/2020/wordml/sdtdatahash" xmlns:w16sdtfl="http://schemas.microsoft.com/office/word/2024/wordml/sdtformatlock" xmlns:w16se="http://schemas.microsoft.com/office/word/2015/wordml/symex" xmlns:wpg="http://schemas.microsoft.com/office/word/2010/wordprocessingGroup" xmlns:wpi="http://schemas.microsoft.com/office/word/2010/wordprocessingInk" xmlns:wne="http://schemas.microsoft.com/office/word/2006/wordml" xmlns:wps="http://schemas.microsoft.com/office/word/2010/wordprocessingShape" mc:Ignorable="w14 w15 w16se w16cid w16 w16cex w16sdtdh w16sdtfl w16du wp14">
+<w:hdr xmlns:wpc="http://schemas.microsoft.com/office/word/2010/wordprocessingCanvas" xmlns:cx="http://schemas.microsoft.com/office/drawing/2014/chartex" xmlns:cx1="http://schemas.microsoft.com/office/drawing/2015/9/8/chartex" xmlns:cx2="http://schemas.microsoft.com/office/drawing/2015/10/21/chartex" xmlns:cx3="http://schemas.microsoft.com/office/drawing/2016/5/9/chartex" xmlns:cx4="http://schemas.microsoft.com/office/drawing/2016/5/10/chartex" xmlns:cx5="http://schemas.microsoft.com/office/drawing/2016/5/11/chartex" xmlns:cx6="http://schemas.microsoft.com/office/drawing/2016/5/12/chartex" xmlns:cx7="http://schemas.microsoft.com/office/drawing/2016/5/13/chartex" xmlns:cx8="http://schemas.microsoft.com/office/drawing/2016/5/14/chartex" xmlns:mc="http://schemas.openxmlformats.org/markup-compatibility/2006" xmlns:aink="http://schemas.microsoft.com/office/drawing/2016/ink" xmlns:am3d="http://schemas.microsoft.com/office/drawing/2017/model3d" xmlns:o="urn:schemas-microsoft-com:office:office" xmlns:oel="http://schemas.microsoft.com/office/2019/extlst" xmlns:r="http://schemas.openxmlformats.org/officeDocument/2006/relationships" xmlns:m="http://schemas.openxmlformats.org/officeDocument/2006/math" xmlns:v="urn:schemas-microsoft-com:vml" xmlns:wp14="http://schemas.microsoft.com/office/word/2010/wordprocessingDrawing" xmlns:wp="http://schemas.openxmlformats.org/drawingml/2006/wordprocessingDrawing" xmlns:w10="urn:schemas-microsoft-com:office:word" xmlns:w="http://schemas.openxmlformats.org/wordprocessingml/2006/main" xmlns:w14="http://schemas.microsoft.com/office/word/2010/wordml" xmlns:w15="http://schemas.microsoft.com/office/word/2012/wordml" xmlns:w16cex="http://schemas.microsoft.com/office/word/2018/wordml/cex" xmlns:w16cid="http://schemas.microsoft.com/office/word/2016/wordml/cid" xmlns:w16="http://schemas.microsoft.com/office/word/2018/wordml" xmlns:w16du="http://schemas.microsoft.com/office/word/2023/wordml/word16du" xmlns:w16sdtdh="http://schemas.microsoft.com/office/word/2020/wordml/sdtdatahash" xmlns:w16sdtfl="http://schemas.microsoft.com/office/word/2024/wordml/sdtformatlock" xmlns:w16se="http://schemas.microsoft.com/office/word/2015/wordml/symex" xmlns:wpg="http://schemas.microsoft.com/office/word/2010/wordprocessingGroup" xmlns:wpi="http://schemas.microsoft.com/office/word/2010/wordprocessingInk" xmlns:wne="http://schemas.microsoft.com/office/word/2006/wordml" xmlns:wps="http://schemas.microsoft.com/office/word/2010/wordprocessingShape" mc:Ignorable="w14 w15 w16se w16cid w16 w16cex w16sdtdh w16sdtfl w16du wp14">
   <w:p>
     <w:pPr>
       <w:pStyle w:val="Encabezado"/>
@@ -2137,14 +3301,14 @@
         <w:sz w:val="28"/>
         <w:szCs w:val="32"/>
       </w:rPr>
-      <w:t>Título de actividad</w:t>
+      <w:t>Parseo</w:t>
     </w:r>
   </w:p>
 </w:hdr>
 </file>
 
 <file path=word/header2.xml><?xml version="1.0" encoding="utf-8"?>
-<w:hdr xmlns:wpc="http://schemas.microsoft.com/office/word/2010/wordprocessingCanvas" xmlns:cx="http://schemas.microsoft.com/office/drawing/2014/chartex" xmlns:cx1="http://schemas.microsoft.com/office/drawing/2015/9/8/chartex" xmlns:cx2="http://schemas.microsoft.com/office/drawing/2015/10/21/chartex" xmlns:cx3="http://schemas.microsoft.com/office/drawing/2016/5/9/chartex" xmlns:cx4="http://schemas.microsoft.com/office/drawing/2016/5/10/chartex" xmlns:cx5="http://schemas.microsoft.com/office/drawing/2016/5/11/chartex" xmlns:cx6="http://schemas.microsoft.com/office/drawing/2016/5/12/chartex" xmlns:cx7="http://schemas.microsoft.com/office/drawing/2016/5/13/chartex" xmlns:cx8="http://schemas.microsoft.com/office/drawing/2016/5/14/chartex" xmlns:mc="http://schemas.openxmlformats.org/markup-compatibility/2006" xmlns:aink="http://schemas.microsoft.com/office/drawing/2016/ink" xmlns:am3d="http://schemas.microsoft.com/office/drawing/2017/model3d" xmlns:o="urn:schemas-microsoft-com:office:office" xmlns:oel="http://schemas.microsoft.com/office/2019/extlst" xmlns:r="http://schemas.openxmlformats.org/officeDocument/2006/relationships" xmlns:m="http://schemas.openxmlformats.org/officeDocument/2006/math" xmlns:v="urn:schemas-microsoft-com:vml" xmlns:wp14="http://schemas.microsoft.com/office/word/2010/wordprocessingDrawing" xmlns:wp="http://schemas.openxmlformats.org/drawingml/2006/wordprocessingDrawing" xmlns:w10="urn:schemas-microsoft-com:office:word" xmlns:w="http://schemas.openxmlformats.org/wordprocessingml/2006/main" xmlns:w14="http://schemas.microsoft.com/office/word/2010/wordml" xmlns:w15="http://schemas.microsoft.com/office/word/2012/wordml" xmlns:w16cei="http://schemas.microsoft.com/office/word/2026/wordml/cei" xmlns:w16cex="http://schemas.microsoft.com/office/word/2018/wordml/cex" xmlns:w16cid="http://schemas.microsoft.com/office/word/2016/wordml/cid" xmlns:w16="http://schemas.microsoft.com/office/word/2018/wordml" xmlns:w16du="http://schemas.microsoft.com/office/word/2023/wordml/word16du" xmlns:w16sdtdh="http://schemas.microsoft.com/office/word/2020/wordml/sdtdatahash" xmlns:w16sdtfl="http://schemas.microsoft.com/office/word/2024/wordml/sdtformatlock" xmlns:w16se="http://schemas.microsoft.com/office/word/2015/wordml/symex" xmlns:wpg="http://schemas.microsoft.com/office/word/2010/wordprocessingGroup" xmlns:wpi="http://schemas.microsoft.com/office/word/2010/wordprocessingInk" xmlns:wne="http://schemas.microsoft.com/office/word/2006/wordml" xmlns:wps="http://schemas.microsoft.com/office/word/2010/wordprocessingShape" mc:Ignorable="w14 w15 w16se w16cid w16 w16cex w16sdtdh w16sdtfl w16du wp14">
+<w:hdr xmlns:wpc="http://schemas.microsoft.com/office/word/2010/wordprocessingCanvas" xmlns:cx="http://schemas.microsoft.com/office/drawing/2014/chartex" xmlns:cx1="http://schemas.microsoft.com/office/drawing/2015/9/8/chartex" xmlns:cx2="http://schemas.microsoft.com/office/drawing/2015/10/21/chartex" xmlns:cx3="http://schemas.microsoft.com/office/drawing/2016/5/9/chartex" xmlns:cx4="http://schemas.microsoft.com/office/drawing/2016/5/10/chartex" xmlns:cx5="http://schemas.microsoft.com/office/drawing/2016/5/11/chartex" xmlns:cx6="http://schemas.microsoft.com/office/drawing/2016/5/12/chartex" xmlns:cx7="http://schemas.microsoft.com/office/drawing/2016/5/13/chartex" xmlns:cx8="http://schemas.microsoft.com/office/drawing/2016/5/14/chartex" xmlns:mc="http://schemas.openxmlformats.org/markup-compatibility/2006" xmlns:aink="http://schemas.microsoft.com/office/drawing/2016/ink" xmlns:am3d="http://schemas.microsoft.com/office/drawing/2017/model3d" xmlns:o="urn:schemas-microsoft-com:office:office" xmlns:oel="http://schemas.microsoft.com/office/2019/extlst" xmlns:r="http://schemas.openxmlformats.org/officeDocument/2006/relationships" xmlns:m="http://schemas.openxmlformats.org/officeDocument/2006/math" xmlns:v="urn:schemas-microsoft-com:vml" xmlns:wp14="http://schemas.microsoft.com/office/word/2010/wordprocessingDrawing" xmlns:wp="http://schemas.openxmlformats.org/drawingml/2006/wordprocessingDrawing" xmlns:w10="urn:schemas-microsoft-com:office:word" xmlns:w="http://schemas.openxmlformats.org/wordprocessingml/2006/main" xmlns:w14="http://schemas.microsoft.com/office/word/2010/wordml" xmlns:w15="http://schemas.microsoft.com/office/word/2012/wordml" xmlns:w16cex="http://schemas.microsoft.com/office/word/2018/wordml/cex" xmlns:w16cid="http://schemas.microsoft.com/office/word/2016/wordml/cid" xmlns:w16="http://schemas.microsoft.com/office/word/2018/wordml" xmlns:w16du="http://schemas.microsoft.com/office/word/2023/wordml/word16du" xmlns:w16sdtdh="http://schemas.microsoft.com/office/word/2020/wordml/sdtdatahash" xmlns:w16sdtfl="http://schemas.microsoft.com/office/word/2024/wordml/sdtformatlock" xmlns:w16se="http://schemas.microsoft.com/office/word/2015/wordml/symex" xmlns:wpg="http://schemas.microsoft.com/office/word/2010/wordprocessingGroup" xmlns:wpi="http://schemas.microsoft.com/office/word/2010/wordprocessingInk" xmlns:wne="http://schemas.microsoft.com/office/word/2006/wordml" xmlns:wps="http://schemas.microsoft.com/office/word/2010/wordprocessingShape" mc:Ignorable="w14 w15 w16se w16cid w16 w16cex w16sdtdh w16sdtfl w16du wp14">
   <w:p>
     <w:pPr>
       <w:pStyle w:val="Encabezado"/>
@@ -2165,7 +3329,7 @@
 </file>
 
 <file path=word/numbering.xml><?xml version="1.0" encoding="utf-8"?>
-<w:numbering xmlns:wpc="http://schemas.microsoft.com/office/word/2010/wordprocessingCanvas" xmlns:cx="http://schemas.microsoft.com/office/drawing/2014/chartex" xmlns:cx1="http://schemas.microsoft.com/office/drawing/2015/9/8/chartex" xmlns:cx2="http://schemas.microsoft.com/office/drawing/2015/10/21/chartex" xmlns:cx3="http://schemas.microsoft.com/office/drawing/2016/5/9/chartex" xmlns:cx4="http://schemas.microsoft.com/office/drawing/2016/5/10/chartex" xmlns:cx5="http://schemas.microsoft.com/office/drawing/2016/5/11/chartex" xmlns:cx6="http://schemas.microsoft.com/office/drawing/2016/5/12/chartex" xmlns:cx7="http://schemas.microsoft.com/office/drawing/2016/5/13/chartex" xmlns:cx8="http://schemas.microsoft.com/office/drawing/2016/5/14/chartex" xmlns:mc="http://schemas.openxmlformats.org/markup-compatibility/2006" xmlns:aink="http://schemas.microsoft.com/office/drawing/2016/ink" xmlns:am3d="http://schemas.microsoft.com/office/drawing/2017/model3d" xmlns:o="urn:schemas-microsoft-com:office:office" xmlns:oel="http://schemas.microsoft.com/office/2019/extlst" xmlns:r="http://schemas.openxmlformats.org/officeDocument/2006/relationships" xmlns:m="http://schemas.openxmlformats.org/officeDocument/2006/math" xmlns:v="urn:schemas-microsoft-com:vml" xmlns:wp14="http://schemas.microsoft.com/office/word/2010/wordprocessingDrawing" xmlns:wp="http://schemas.openxmlformats.org/drawingml/2006/wordprocessingDrawing" xmlns:w10="urn:schemas-microsoft-com:office:word" xmlns:w="http://schemas.openxmlformats.org/wordprocessingml/2006/main" xmlns:w14="http://schemas.microsoft.com/office/word/2010/wordml" xmlns:w15="http://schemas.microsoft.com/office/word/2012/wordml" xmlns:w16cei="http://schemas.microsoft.com/office/word/2026/wordml/cei" xmlns:w16cex="http://schemas.microsoft.com/office/word/2018/wordml/cex" xmlns:w16cid="http://schemas.microsoft.com/office/word/2016/wordml/cid" xmlns:w16="http://schemas.microsoft.com/office/word/2018/wordml" xmlns:w16du="http://schemas.microsoft.com/office/word/2023/wordml/word16du" xmlns:w16sdtdh="http://schemas.microsoft.com/office/word/2020/wordml/sdtdatahash" xmlns:w16sdtfl="http://schemas.microsoft.com/office/word/2024/wordml/sdtformatlock" xmlns:w16se="http://schemas.microsoft.com/office/word/2015/wordml/symex" xmlns:wpg="http://schemas.microsoft.com/office/word/2010/wordprocessingGroup" xmlns:wpi="http://schemas.microsoft.com/office/word/2010/wordprocessingInk" xmlns:wne="http://schemas.microsoft.com/office/word/2006/wordml" xmlns:wps="http://schemas.microsoft.com/office/word/2010/wordprocessingShape" mc:Ignorable="w14 w15 w16se w16cid w16 w16cex w16sdtdh w16sdtfl w16du wp14">
+<w:numbering xmlns:wpc="http://schemas.microsoft.com/office/word/2010/wordprocessingCanvas" xmlns:cx="http://schemas.microsoft.com/office/drawing/2014/chartex" xmlns:cx1="http://schemas.microsoft.com/office/drawing/2015/9/8/chartex" xmlns:cx2="http://schemas.microsoft.com/office/drawing/2015/10/21/chartex" xmlns:cx3="http://schemas.microsoft.com/office/drawing/2016/5/9/chartex" xmlns:cx4="http://schemas.microsoft.com/office/drawing/2016/5/10/chartex" xmlns:cx5="http://schemas.microsoft.com/office/drawing/2016/5/11/chartex" xmlns:cx6="http://schemas.microsoft.com/office/drawing/2016/5/12/chartex" xmlns:cx7="http://schemas.microsoft.com/office/drawing/2016/5/13/chartex" xmlns:cx8="http://schemas.microsoft.com/office/drawing/2016/5/14/chartex" xmlns:mc="http://schemas.openxmlformats.org/markup-compatibility/2006" xmlns:aink="http://schemas.microsoft.com/office/drawing/2016/ink" xmlns:am3d="http://schemas.microsoft.com/office/drawing/2017/model3d" xmlns:o="urn:schemas-microsoft-com:office:office" xmlns:oel="http://schemas.microsoft.com/office/2019/extlst" xmlns:r="http://schemas.openxmlformats.org/officeDocument/2006/relationships" xmlns:m="http://schemas.openxmlformats.org/officeDocument/2006/math" xmlns:v="urn:schemas-microsoft-com:vml" xmlns:wp14="http://schemas.microsoft.com/office/word/2010/wordprocessingDrawing" xmlns:wp="http://schemas.openxmlformats.org/drawingml/2006/wordprocessingDrawing" xmlns:w10="urn:schemas-microsoft-com:office:word" xmlns:w="http://schemas.openxmlformats.org/wordprocessingml/2006/main" xmlns:w14="http://schemas.microsoft.com/office/word/2010/wordml" xmlns:w15="http://schemas.microsoft.com/office/word/2012/wordml" xmlns:w16cex="http://schemas.microsoft.com/office/word/2018/wordml/cex" xmlns:w16cid="http://schemas.microsoft.com/office/word/2016/wordml/cid" xmlns:w16="http://schemas.microsoft.com/office/word/2018/wordml" xmlns:w16du="http://schemas.microsoft.com/office/word/2023/wordml/word16du" xmlns:w16sdtdh="http://schemas.microsoft.com/office/word/2020/wordml/sdtdatahash" xmlns:w16sdtfl="http://schemas.microsoft.com/office/word/2024/wordml/sdtformatlock" xmlns:w16se="http://schemas.microsoft.com/office/word/2015/wordml/symex" xmlns:wpg="http://schemas.microsoft.com/office/word/2010/wordprocessingGroup" xmlns:wpi="http://schemas.microsoft.com/office/word/2010/wordprocessingInk" xmlns:wne="http://schemas.microsoft.com/office/word/2006/wordml" xmlns:wps="http://schemas.microsoft.com/office/word/2010/wordprocessingShape" mc:Ignorable="w14 w15 w16se w16cid w16 w16cex w16sdtdh w16sdtfl w16du wp14">
   <w:abstractNum w:abstractNumId="0" w15:restartNumberingAfterBreak="0">
     <w:nsid w:val="004044FA"/>
     <w:multiLevelType w:val="hybridMultilevel"/>
@@ -2544,6 +3708,119 @@
     </w:lvl>
   </w:abstractNum>
   <w:abstractNum w:abstractNumId="4" w15:restartNumberingAfterBreak="0">
+    <w:nsid w:val="0EA74482"/>
+    <w:multiLevelType w:val="hybridMultilevel"/>
+    <w:tmpl w:val="083A108A"/>
+    <w:lvl w:ilvl="0" w:tplc="080A0001">
+      <w:start w:val="1"/>
+      <w:numFmt w:val="bullet"/>
+      <w:lvlText w:val=""/>
+      <w:lvlJc w:val="left"/>
+      <w:pPr>
+        <w:ind w:left="720" w:hanging="360"/>
+      </w:pPr>
+      <w:rPr>
+        <w:rFonts w:ascii="Symbol" w:hAnsi="Symbol" w:hint="default"/>
+      </w:rPr>
+    </w:lvl>
+    <w:lvl w:ilvl="1" w:tplc="080A0003" w:tentative="1">
+      <w:start w:val="1"/>
+      <w:numFmt w:val="bullet"/>
+      <w:lvlText w:val="o"/>
+      <w:lvlJc w:val="left"/>
+      <w:pPr>
+        <w:ind w:left="1440" w:hanging="360"/>
+      </w:pPr>
+      <w:rPr>
+        <w:rFonts w:ascii="Courier New" w:hAnsi="Courier New" w:cs="Courier New" w:hint="default"/>
+      </w:rPr>
+    </w:lvl>
+    <w:lvl w:ilvl="2" w:tplc="080A0005" w:tentative="1">
+      <w:start w:val="1"/>
+      <w:numFmt w:val="bullet"/>
+      <w:lvlText w:val=""/>
+      <w:lvlJc w:val="left"/>
+      <w:pPr>
+        <w:ind w:left="2160" w:hanging="360"/>
+      </w:pPr>
+      <w:rPr>
+        <w:rFonts w:ascii="Wingdings" w:hAnsi="Wingdings" w:hint="default"/>
+      </w:rPr>
+    </w:lvl>
+    <w:lvl w:ilvl="3" w:tplc="080A0001" w:tentative="1">
+      <w:start w:val="1"/>
+      <w:numFmt w:val="bullet"/>
+      <w:lvlText w:val=""/>
+      <w:lvlJc w:val="left"/>
+      <w:pPr>
+        <w:ind w:left="2880" w:hanging="360"/>
+      </w:pPr>
+      <w:rPr>
+        <w:rFonts w:ascii="Symbol" w:hAnsi="Symbol" w:hint="default"/>
+      </w:rPr>
+    </w:lvl>
+    <w:lvl w:ilvl="4" w:tplc="080A0003" w:tentative="1">
+      <w:start w:val="1"/>
+      <w:numFmt w:val="bullet"/>
+      <w:lvlText w:val="o"/>
+      <w:lvlJc w:val="left"/>
+      <w:pPr>
+        <w:ind w:left="3600" w:hanging="360"/>
+      </w:pPr>
+      <w:rPr>
+        <w:rFonts w:ascii="Courier New" w:hAnsi="Courier New" w:cs="Courier New" w:hint="default"/>
+      </w:rPr>
+    </w:lvl>
+    <w:lvl w:ilvl="5" w:tplc="080A0005" w:tentative="1">
+      <w:start w:val="1"/>
+      <w:numFmt w:val="bullet"/>
+      <w:lvlText w:val=""/>
+      <w:lvlJc w:val="left"/>
+      <w:pPr>
+        <w:ind w:left="4320" w:hanging="360"/>
+      </w:pPr>
+      <w:rPr>
+        <w:rFonts w:ascii="Wingdings" w:hAnsi="Wingdings" w:hint="default"/>
+      </w:rPr>
+    </w:lvl>
+    <w:lvl w:ilvl="6" w:tplc="080A0001" w:tentative="1">
+      <w:start w:val="1"/>
+      <w:numFmt w:val="bullet"/>
+      <w:lvlText w:val=""/>
+      <w:lvlJc w:val="left"/>
+      <w:pPr>
+        <w:ind w:left="5040" w:hanging="360"/>
+      </w:pPr>
+      <w:rPr>
+        <w:rFonts w:ascii="Symbol" w:hAnsi="Symbol" w:hint="default"/>
+      </w:rPr>
+    </w:lvl>
+    <w:lvl w:ilvl="7" w:tplc="080A0003" w:tentative="1">
+      <w:start w:val="1"/>
+      <w:numFmt w:val="bullet"/>
+      <w:lvlText w:val="o"/>
+      <w:lvlJc w:val="left"/>
+      <w:pPr>
+        <w:ind w:left="5760" w:hanging="360"/>
+      </w:pPr>
+      <w:rPr>
+        <w:rFonts w:ascii="Courier New" w:hAnsi="Courier New" w:cs="Courier New" w:hint="default"/>
+      </w:rPr>
+    </w:lvl>
+    <w:lvl w:ilvl="8" w:tplc="080A0005" w:tentative="1">
+      <w:start w:val="1"/>
+      <w:numFmt w:val="bullet"/>
+      <w:lvlText w:val=""/>
+      <w:lvlJc w:val="left"/>
+      <w:pPr>
+        <w:ind w:left="6480" w:hanging="360"/>
+      </w:pPr>
+      <w:rPr>
+        <w:rFonts w:ascii="Wingdings" w:hAnsi="Wingdings" w:hint="default"/>
+      </w:rPr>
+    </w:lvl>
+  </w:abstractNum>
+  <w:abstractNum w:abstractNumId="5" w15:restartNumberingAfterBreak="0">
     <w:nsid w:val="0F695D61"/>
     <w:multiLevelType w:val="hybridMultilevel"/>
     <w:tmpl w:val="252EDE04"/>
@@ -2629,7 +3906,7 @@
       </w:pPr>
     </w:lvl>
   </w:abstractNum>
-  <w:abstractNum w:abstractNumId="5" w15:restartNumberingAfterBreak="0">
+  <w:abstractNum w:abstractNumId="6" w15:restartNumberingAfterBreak="0">
     <w:nsid w:val="11081312"/>
     <w:multiLevelType w:val="hybridMultilevel"/>
     <w:tmpl w:val="9E5816B2"/>
@@ -2715,7 +3992,7 @@
       </w:pPr>
     </w:lvl>
   </w:abstractNum>
-  <w:abstractNum w:abstractNumId="6" w15:restartNumberingAfterBreak="0">
+  <w:abstractNum w:abstractNumId="7" w15:restartNumberingAfterBreak="0">
     <w:nsid w:val="15B75010"/>
     <w:multiLevelType w:val="hybridMultilevel"/>
     <w:tmpl w:val="85520E40"/>
@@ -2828,7 +4105,7 @@
       </w:rPr>
     </w:lvl>
   </w:abstractNum>
-  <w:abstractNum w:abstractNumId="7" w15:restartNumberingAfterBreak="0">
+  <w:abstractNum w:abstractNumId="8" w15:restartNumberingAfterBreak="0">
     <w:nsid w:val="1AEC06E6"/>
     <w:multiLevelType w:val="hybridMultilevel"/>
     <w:tmpl w:val="CDD8829A"/>
@@ -2941,7 +4218,7 @@
       </w:rPr>
     </w:lvl>
   </w:abstractNum>
-  <w:abstractNum w:abstractNumId="8" w15:restartNumberingAfterBreak="0">
+  <w:abstractNum w:abstractNumId="9" w15:restartNumberingAfterBreak="0">
     <w:nsid w:val="2357072B"/>
     <w:multiLevelType w:val="hybridMultilevel"/>
     <w:tmpl w:val="383E2788"/>
@@ -3054,7 +4331,7 @@
       </w:rPr>
     </w:lvl>
   </w:abstractNum>
-  <w:abstractNum w:abstractNumId="9" w15:restartNumberingAfterBreak="0">
+  <w:abstractNum w:abstractNumId="10" w15:restartNumberingAfterBreak="0">
     <w:nsid w:val="252C402B"/>
     <w:multiLevelType w:val="hybridMultilevel"/>
     <w:tmpl w:val="E3828E10"/>
@@ -3167,7 +4444,7 @@
       </w:rPr>
     </w:lvl>
   </w:abstractNum>
-  <w:abstractNum w:abstractNumId="10" w15:restartNumberingAfterBreak="0">
+  <w:abstractNum w:abstractNumId="11" w15:restartNumberingAfterBreak="0">
     <w:nsid w:val="26704FAC"/>
     <w:multiLevelType w:val="hybridMultilevel"/>
     <w:tmpl w:val="78A259AE"/>
@@ -3280,7 +4557,7 @@
       </w:rPr>
     </w:lvl>
   </w:abstractNum>
-  <w:abstractNum w:abstractNumId="11" w15:restartNumberingAfterBreak="0">
+  <w:abstractNum w:abstractNumId="12" w15:restartNumberingAfterBreak="0">
     <w:nsid w:val="27A2319E"/>
     <w:multiLevelType w:val="hybridMultilevel"/>
     <w:tmpl w:val="E974ABBC"/>
@@ -3393,7 +4670,7 @@
       </w:rPr>
     </w:lvl>
   </w:abstractNum>
-  <w:abstractNum w:abstractNumId="12" w15:restartNumberingAfterBreak="0">
+  <w:abstractNum w:abstractNumId="13" w15:restartNumberingAfterBreak="0">
     <w:nsid w:val="2A4E31E0"/>
     <w:multiLevelType w:val="hybridMultilevel"/>
     <w:tmpl w:val="595C7D88"/>
@@ -3506,7 +4783,7 @@
       </w:rPr>
     </w:lvl>
   </w:abstractNum>
-  <w:abstractNum w:abstractNumId="13" w15:restartNumberingAfterBreak="0">
+  <w:abstractNum w:abstractNumId="14" w15:restartNumberingAfterBreak="0">
     <w:nsid w:val="2C0B5195"/>
     <w:multiLevelType w:val="hybridMultilevel"/>
     <w:tmpl w:val="FE9C5F14"/>
@@ -3619,7 +4896,7 @@
       </w:rPr>
     </w:lvl>
   </w:abstractNum>
-  <w:abstractNum w:abstractNumId="14" w15:restartNumberingAfterBreak="0">
+  <w:abstractNum w:abstractNumId="15" w15:restartNumberingAfterBreak="0">
     <w:nsid w:val="32E8256A"/>
     <w:multiLevelType w:val="hybridMultilevel"/>
     <w:tmpl w:val="35B27F0C"/>
@@ -3732,7 +5009,7 @@
       </w:rPr>
     </w:lvl>
   </w:abstractNum>
-  <w:abstractNum w:abstractNumId="15" w15:restartNumberingAfterBreak="0">
+  <w:abstractNum w:abstractNumId="16" w15:restartNumberingAfterBreak="0">
     <w:nsid w:val="3D2C0E66"/>
     <w:multiLevelType w:val="hybridMultilevel"/>
     <w:tmpl w:val="324A86FE"/>
@@ -3845,7 +5122,7 @@
       </w:rPr>
     </w:lvl>
   </w:abstractNum>
-  <w:abstractNum w:abstractNumId="16" w15:restartNumberingAfterBreak="0">
+  <w:abstractNum w:abstractNumId="17" w15:restartNumberingAfterBreak="0">
     <w:nsid w:val="3D4950BC"/>
     <w:multiLevelType w:val="hybridMultilevel"/>
     <w:tmpl w:val="32C636D8"/>
@@ -3958,7 +5235,7 @@
       </w:rPr>
     </w:lvl>
   </w:abstractNum>
-  <w:abstractNum w:abstractNumId="17" w15:restartNumberingAfterBreak="0">
+  <w:abstractNum w:abstractNumId="18" w15:restartNumberingAfterBreak="0">
     <w:nsid w:val="3EE357D5"/>
     <w:multiLevelType w:val="hybridMultilevel"/>
     <w:tmpl w:val="B06250B4"/>
@@ -4071,7 +5348,7 @@
       </w:rPr>
     </w:lvl>
   </w:abstractNum>
-  <w:abstractNum w:abstractNumId="18" w15:restartNumberingAfterBreak="0">
+  <w:abstractNum w:abstractNumId="19" w15:restartNumberingAfterBreak="0">
     <w:nsid w:val="432058A2"/>
     <w:multiLevelType w:val="hybridMultilevel"/>
     <w:tmpl w:val="EC5621DC"/>
@@ -4184,7 +5461,7 @@
       </w:rPr>
     </w:lvl>
   </w:abstractNum>
-  <w:abstractNum w:abstractNumId="19" w15:restartNumberingAfterBreak="0">
+  <w:abstractNum w:abstractNumId="20" w15:restartNumberingAfterBreak="0">
     <w:nsid w:val="45C55BFE"/>
     <w:multiLevelType w:val="hybridMultilevel"/>
     <w:tmpl w:val="D92E599C"/>
@@ -4297,7 +5574,7 @@
       </w:rPr>
     </w:lvl>
   </w:abstractNum>
-  <w:abstractNum w:abstractNumId="20" w15:restartNumberingAfterBreak="0">
+  <w:abstractNum w:abstractNumId="21" w15:restartNumberingAfterBreak="0">
     <w:nsid w:val="4789116B"/>
     <w:multiLevelType w:val="hybridMultilevel"/>
     <w:tmpl w:val="F5D0E744"/>
@@ -4410,7 +5687,7 @@
       </w:rPr>
     </w:lvl>
   </w:abstractNum>
-  <w:abstractNum w:abstractNumId="21" w15:restartNumberingAfterBreak="0">
+  <w:abstractNum w:abstractNumId="22" w15:restartNumberingAfterBreak="0">
     <w:nsid w:val="4FA653D3"/>
     <w:multiLevelType w:val="hybridMultilevel"/>
     <w:tmpl w:val="2F145B30"/>
@@ -4499,7 +5776,93 @@
       </w:pPr>
     </w:lvl>
   </w:abstractNum>
-  <w:abstractNum w:abstractNumId="22" w15:restartNumberingAfterBreak="0">
+  <w:abstractNum w:abstractNumId="23" w15:restartNumberingAfterBreak="0">
+    <w:nsid w:val="5C515CE7"/>
+    <w:multiLevelType w:val="hybridMultilevel"/>
+    <w:tmpl w:val="C8BC8EDE"/>
+    <w:lvl w:ilvl="0" w:tplc="080A000F">
+      <w:start w:val="1"/>
+      <w:numFmt w:val="decimal"/>
+      <w:lvlText w:val="%1."/>
+      <w:lvlJc w:val="left"/>
+      <w:pPr>
+        <w:ind w:left="720" w:hanging="360"/>
+      </w:pPr>
+    </w:lvl>
+    <w:lvl w:ilvl="1" w:tplc="080A0019">
+      <w:start w:val="1"/>
+      <w:numFmt w:val="lowerLetter"/>
+      <w:lvlText w:val="%2."/>
+      <w:lvlJc w:val="left"/>
+      <w:pPr>
+        <w:ind w:left="1440" w:hanging="360"/>
+      </w:pPr>
+    </w:lvl>
+    <w:lvl w:ilvl="2" w:tplc="080A001B" w:tentative="1">
+      <w:start w:val="1"/>
+      <w:numFmt w:val="lowerRoman"/>
+      <w:lvlText w:val="%3."/>
+      <w:lvlJc w:val="right"/>
+      <w:pPr>
+        <w:ind w:left="2160" w:hanging="180"/>
+      </w:pPr>
+    </w:lvl>
+    <w:lvl w:ilvl="3" w:tplc="080A000F" w:tentative="1">
+      <w:start w:val="1"/>
+      <w:numFmt w:val="decimal"/>
+      <w:lvlText w:val="%4."/>
+      <w:lvlJc w:val="left"/>
+      <w:pPr>
+        <w:ind w:left="2880" w:hanging="360"/>
+      </w:pPr>
+    </w:lvl>
+    <w:lvl w:ilvl="4" w:tplc="080A0019" w:tentative="1">
+      <w:start w:val="1"/>
+      <w:numFmt w:val="lowerLetter"/>
+      <w:lvlText w:val="%5."/>
+      <w:lvlJc w:val="left"/>
+      <w:pPr>
+        <w:ind w:left="3600" w:hanging="360"/>
+      </w:pPr>
+    </w:lvl>
+    <w:lvl w:ilvl="5" w:tplc="080A001B" w:tentative="1">
+      <w:start w:val="1"/>
+      <w:numFmt w:val="lowerRoman"/>
+      <w:lvlText w:val="%6."/>
+      <w:lvlJc w:val="right"/>
+      <w:pPr>
+        <w:ind w:left="4320" w:hanging="180"/>
+      </w:pPr>
+    </w:lvl>
+    <w:lvl w:ilvl="6" w:tplc="080A000F" w:tentative="1">
+      <w:start w:val="1"/>
+      <w:numFmt w:val="decimal"/>
+      <w:lvlText w:val="%7."/>
+      <w:lvlJc w:val="left"/>
+      <w:pPr>
+        <w:ind w:left="5040" w:hanging="360"/>
+      </w:pPr>
+    </w:lvl>
+    <w:lvl w:ilvl="7" w:tplc="080A0019" w:tentative="1">
+      <w:start w:val="1"/>
+      <w:numFmt w:val="lowerLetter"/>
+      <w:lvlText w:val="%8."/>
+      <w:lvlJc w:val="left"/>
+      <w:pPr>
+        <w:ind w:left="5760" w:hanging="360"/>
+      </w:pPr>
+    </w:lvl>
+    <w:lvl w:ilvl="8" w:tplc="080A001B" w:tentative="1">
+      <w:start w:val="1"/>
+      <w:numFmt w:val="lowerRoman"/>
+      <w:lvlText w:val="%9."/>
+      <w:lvlJc w:val="right"/>
+      <w:pPr>
+        <w:ind w:left="6480" w:hanging="180"/>
+      </w:pPr>
+    </w:lvl>
+  </w:abstractNum>
+  <w:abstractNum w:abstractNumId="24" w15:restartNumberingAfterBreak="0">
     <w:nsid w:val="5C614E09"/>
     <w:multiLevelType w:val="hybridMultilevel"/>
     <w:tmpl w:val="C6F0588A"/>
@@ -4585,7 +5948,7 @@
       </w:pPr>
     </w:lvl>
   </w:abstractNum>
-  <w:abstractNum w:abstractNumId="23" w15:restartNumberingAfterBreak="0">
+  <w:abstractNum w:abstractNumId="25" w15:restartNumberingAfterBreak="0">
     <w:nsid w:val="5D0303E9"/>
     <w:multiLevelType w:val="hybridMultilevel"/>
     <w:tmpl w:val="7BF8642E"/>
@@ -4671,7 +6034,7 @@
       </w:pPr>
     </w:lvl>
   </w:abstractNum>
-  <w:abstractNum w:abstractNumId="24" w15:restartNumberingAfterBreak="0">
+  <w:abstractNum w:abstractNumId="26" w15:restartNumberingAfterBreak="0">
     <w:nsid w:val="5D3E675A"/>
     <w:multiLevelType w:val="hybridMultilevel"/>
     <w:tmpl w:val="531CDDE4"/>
@@ -4784,7 +6147,7 @@
       </w:rPr>
     </w:lvl>
   </w:abstractNum>
-  <w:abstractNum w:abstractNumId="25" w15:restartNumberingAfterBreak="0">
+  <w:abstractNum w:abstractNumId="27" w15:restartNumberingAfterBreak="0">
     <w:nsid w:val="5E2162D0"/>
     <w:multiLevelType w:val="hybridMultilevel"/>
     <w:tmpl w:val="19F640F0"/>
@@ -4897,7 +6260,7 @@
       </w:rPr>
     </w:lvl>
   </w:abstractNum>
-  <w:abstractNum w:abstractNumId="26" w15:restartNumberingAfterBreak="0">
+  <w:abstractNum w:abstractNumId="28" w15:restartNumberingAfterBreak="0">
     <w:nsid w:val="63520ADD"/>
     <w:multiLevelType w:val="hybridMultilevel"/>
     <w:tmpl w:val="D97630C4"/>
@@ -5010,7 +6373,7 @@
       </w:rPr>
     </w:lvl>
   </w:abstractNum>
-  <w:abstractNum w:abstractNumId="27" w15:restartNumberingAfterBreak="0">
+  <w:abstractNum w:abstractNumId="29" w15:restartNumberingAfterBreak="0">
     <w:nsid w:val="67A32EBF"/>
     <w:multiLevelType w:val="hybridMultilevel"/>
     <w:tmpl w:val="127C7076"/>
@@ -5123,7 +6486,7 @@
       </w:rPr>
     </w:lvl>
   </w:abstractNum>
-  <w:abstractNum w:abstractNumId="28" w15:restartNumberingAfterBreak="0">
+  <w:abstractNum w:abstractNumId="30" w15:restartNumberingAfterBreak="0">
     <w:nsid w:val="6E6F759E"/>
     <w:multiLevelType w:val="hybridMultilevel"/>
     <w:tmpl w:val="1CA448FC"/>
@@ -5236,7 +6599,7 @@
       </w:rPr>
     </w:lvl>
   </w:abstractNum>
-  <w:abstractNum w:abstractNumId="29" w15:restartNumberingAfterBreak="0">
+  <w:abstractNum w:abstractNumId="31" w15:restartNumberingAfterBreak="0">
     <w:nsid w:val="784530C1"/>
     <w:multiLevelType w:val="hybridMultilevel"/>
     <w:tmpl w:val="3CF6FE18"/>
@@ -5349,7 +6712,7 @@
       </w:rPr>
     </w:lvl>
   </w:abstractNum>
-  <w:abstractNum w:abstractNumId="30" w15:restartNumberingAfterBreak="0">
+  <w:abstractNum w:abstractNumId="32" w15:restartNumberingAfterBreak="0">
     <w:nsid w:val="7C226B17"/>
     <w:multiLevelType w:val="hybridMultilevel"/>
     <w:tmpl w:val="316EBF58"/>
@@ -5462,7 +6825,7 @@
       </w:rPr>
     </w:lvl>
   </w:abstractNum>
-  <w:abstractNum w:abstractNumId="31" w15:restartNumberingAfterBreak="0">
+  <w:abstractNum w:abstractNumId="33" w15:restartNumberingAfterBreak="0">
     <w:nsid w:val="7C7324D3"/>
     <w:multiLevelType w:val="hybridMultilevel"/>
     <w:tmpl w:val="FBB601F2"/>
@@ -5576,100 +6939,106 @@
     </w:lvl>
   </w:abstractNum>
   <w:num w:numId="1" w16cid:durableId="1507473298">
+    <w:abstractNumId w:val="6"/>
+  </w:num>
+  <w:num w:numId="2" w16cid:durableId="1810004600">
     <w:abstractNumId w:val="5"/>
   </w:num>
-  <w:num w:numId="2" w16cid:durableId="1810004600">
-    <w:abstractNumId w:val="4"/>
-  </w:num>
   <w:num w:numId="3" w16cid:durableId="1516307261">
-    <w:abstractNumId w:val="27"/>
+    <w:abstractNumId w:val="29"/>
   </w:num>
   <w:num w:numId="4" w16cid:durableId="263998001">
-    <w:abstractNumId w:val="29"/>
+    <w:abstractNumId w:val="31"/>
   </w:num>
   <w:num w:numId="5" w16cid:durableId="1694530711">
     <w:abstractNumId w:val="3"/>
   </w:num>
   <w:num w:numId="6" w16cid:durableId="399212304">
-    <w:abstractNumId w:val="26"/>
+    <w:abstractNumId w:val="28"/>
   </w:num>
   <w:num w:numId="7" w16cid:durableId="1510755812">
-    <w:abstractNumId w:val="31"/>
+    <w:abstractNumId w:val="33"/>
   </w:num>
   <w:num w:numId="8" w16cid:durableId="401295270">
-    <w:abstractNumId w:val="28"/>
+    <w:abstractNumId w:val="30"/>
   </w:num>
   <w:num w:numId="9" w16cid:durableId="1237131580">
-    <w:abstractNumId w:val="16"/>
+    <w:abstractNumId w:val="17"/>
   </w:num>
   <w:num w:numId="10" w16cid:durableId="1815832771">
-    <w:abstractNumId w:val="19"/>
+    <w:abstractNumId w:val="20"/>
   </w:num>
   <w:num w:numId="11" w16cid:durableId="1210530553">
-    <w:abstractNumId w:val="10"/>
+    <w:abstractNumId w:val="11"/>
   </w:num>
   <w:num w:numId="12" w16cid:durableId="709888915">
-    <w:abstractNumId w:val="15"/>
+    <w:abstractNumId w:val="16"/>
   </w:num>
   <w:num w:numId="13" w16cid:durableId="1638875566">
     <w:abstractNumId w:val="0"/>
   </w:num>
   <w:num w:numId="14" w16cid:durableId="1857187464">
-    <w:abstractNumId w:val="11"/>
+    <w:abstractNumId w:val="12"/>
   </w:num>
   <w:num w:numId="15" w16cid:durableId="1398281611">
+    <w:abstractNumId w:val="10"/>
+  </w:num>
+  <w:num w:numId="16" w16cid:durableId="2101368299">
+    <w:abstractNumId w:val="27"/>
+  </w:num>
+  <w:num w:numId="17" w16cid:durableId="1383942363">
+    <w:abstractNumId w:val="15"/>
+  </w:num>
+  <w:num w:numId="18" w16cid:durableId="975914109">
+    <w:abstractNumId w:val="19"/>
+  </w:num>
+  <w:num w:numId="19" w16cid:durableId="707417816">
+    <w:abstractNumId w:val="24"/>
+  </w:num>
+  <w:num w:numId="20" w16cid:durableId="1331831440">
+    <w:abstractNumId w:val="8"/>
+  </w:num>
+  <w:num w:numId="21" w16cid:durableId="1910534101">
+    <w:abstractNumId w:val="32"/>
+  </w:num>
+  <w:num w:numId="22" w16cid:durableId="124473379">
     <w:abstractNumId w:val="9"/>
   </w:num>
-  <w:num w:numId="16" w16cid:durableId="2101368299">
-    <w:abstractNumId w:val="25"/>
-  </w:num>
-  <w:num w:numId="17" w16cid:durableId="1383942363">
-    <w:abstractNumId w:val="14"/>
-  </w:num>
-  <w:num w:numId="18" w16cid:durableId="975914109">
-    <w:abstractNumId w:val="18"/>
-  </w:num>
-  <w:num w:numId="19" w16cid:durableId="707417816">
-    <w:abstractNumId w:val="22"/>
-  </w:num>
-  <w:num w:numId="20" w16cid:durableId="1331831440">
-    <w:abstractNumId w:val="7"/>
-  </w:num>
-  <w:num w:numId="21" w16cid:durableId="1910534101">
-    <w:abstractNumId w:val="30"/>
-  </w:num>
-  <w:num w:numId="22" w16cid:durableId="124473379">
-    <w:abstractNumId w:val="8"/>
-  </w:num>
   <w:num w:numId="23" w16cid:durableId="256406080">
-    <w:abstractNumId w:val="24"/>
+    <w:abstractNumId w:val="26"/>
   </w:num>
   <w:num w:numId="24" w16cid:durableId="1952279886">
     <w:abstractNumId w:val="1"/>
   </w:num>
   <w:num w:numId="25" w16cid:durableId="667830043">
-    <w:abstractNumId w:val="6"/>
+    <w:abstractNumId w:val="7"/>
   </w:num>
   <w:num w:numId="26" w16cid:durableId="200168938">
-    <w:abstractNumId w:val="17"/>
+    <w:abstractNumId w:val="18"/>
   </w:num>
   <w:num w:numId="27" w16cid:durableId="240065754">
-    <w:abstractNumId w:val="13"/>
+    <w:abstractNumId w:val="14"/>
   </w:num>
   <w:num w:numId="28" w16cid:durableId="1593396341">
-    <w:abstractNumId w:val="23"/>
+    <w:abstractNumId w:val="25"/>
   </w:num>
   <w:num w:numId="29" w16cid:durableId="36511375">
-    <w:abstractNumId w:val="21"/>
+    <w:abstractNumId w:val="22"/>
   </w:num>
   <w:num w:numId="30" w16cid:durableId="853804131">
     <w:abstractNumId w:val="2"/>
   </w:num>
   <w:num w:numId="31" w16cid:durableId="1256211548">
-    <w:abstractNumId w:val="20"/>
+    <w:abstractNumId w:val="21"/>
   </w:num>
   <w:num w:numId="32" w16cid:durableId="1482887219">
-    <w:abstractNumId w:val="12"/>
+    <w:abstractNumId w:val="13"/>
+  </w:num>
+  <w:num w:numId="33" w16cid:durableId="166331193">
+    <w:abstractNumId w:val="23"/>
+  </w:num>
+  <w:num w:numId="34" w16cid:durableId="1175338998">
+    <w:abstractNumId w:val="4"/>
   </w:num>
   <w:numIdMacAtCleanup w:val="13"/>
 </w:numbering>
@@ -7208,6 +8577,17 @@
       <w:iCs/>
     </w:rPr>
   </w:style>
+  <w:style w:type="paragraph" w:styleId="Tabladeilustraciones">
+    <w:name w:val="table of figures"/>
+    <w:basedOn w:val="Normal"/>
+    <w:next w:val="Normal"/>
+    <w:uiPriority w:val="99"/>
+    <w:unhideWhenUsed/>
+    <w:rsid w:val="00E9531A"/>
+    <w:pPr>
+      <w:spacing w:after="0"/>
+    </w:pPr>
+  </w:style>
 </w:styles>
 </file>
 

</xml_diff>